<commit_message>
Adding NodeJS Jest Notes
</commit_message>
<xml_diff>
--- a/Jest/My-Notes/Jest-Notes-01.docx
+++ b/Jest/My-Notes/Jest-Notes-01.docx
@@ -9,6 +9,9 @@
     </w:p>
     <w:p>
       <w:r>
+        <w:rPr>
+          <w:noProof/>
+        </w:rPr>
         <w:drawing>
           <wp:anchor distT="0" distB="0" distL="114300" distR="114300" simplePos="0" relativeHeight="251658240" behindDoc="0" locked="0" layoutInCell="1" allowOverlap="1" wp14:anchorId="7ABAC868" wp14:editId="05DEE066">
             <wp:simplePos x="914400" y="1234440"/>
@@ -867,6 +870,2361 @@
           <w14:ligatures w14:val="none"/>
         </w:rPr>
         <w:t>}</w:t>
+      </w:r>
+    </w:p>
+    <w:p>
+      <w:pPr>
+        <w:ind w:firstLine="720"/>
+      </w:pPr>
+      <w:r>
+        <w:t>*************************************************************</w:t>
+      </w:r>
+    </w:p>
+    <w:p>
+      <w:r>
+        <w:t xml:space="preserve">To mock the function, we use </w:t>
+      </w:r>
+      <w:r>
+        <w:rPr>
+          <w:b/>
+          <w:bCs/>
+          <w:color w:val="3A7C22" w:themeColor="accent6" w:themeShade="BF"/>
+        </w:rPr>
+        <w:t>jest.mock</w:t>
+      </w:r>
+      <w:r>
+        <w:t>, where jest is a global variable</w:t>
+      </w:r>
+      <w:r>
+        <w:t xml:space="preserve">. Then we use </w:t>
+      </w:r>
+      <w:r>
+        <w:rPr>
+          <w:b/>
+          <w:bCs/>
+          <w:color w:val="3A7C22" w:themeColor="accent6" w:themeShade="BF"/>
+        </w:rPr>
+        <w:t>mockResolvedValueOnce</w:t>
+      </w:r>
+      <w:r>
+        <w:rPr>
+          <w:color w:val="3A7C22" w:themeColor="accent6" w:themeShade="BF"/>
+        </w:rPr>
+        <w:t xml:space="preserve"> </w:t>
+      </w:r>
+      <w:r>
+        <w:t>to change the value:</w:t>
+      </w:r>
+    </w:p>
+    <w:p>
+      <w:pPr>
+        <w:shd w:val="clear" w:color="auto" w:fill="FFFFFF"/>
+        <w:spacing w:after="0" w:line="285" w:lineRule="atLeast"/>
+        <w:rPr>
+          <w:rFonts w:ascii="Consolas" w:eastAsia="Times New Roman" w:hAnsi="Consolas" w:cs="Times New Roman"/>
+          <w:color w:val="3B3B3B"/>
+          <w:kern w:val="0"/>
+          <w:sz w:val="21"/>
+          <w:szCs w:val="21"/>
+          <w14:ligatures w14:val="none"/>
+        </w:rPr>
+      </w:pPr>
+      <w:r>
+        <w:rPr>
+          <w:rFonts w:ascii="Consolas" w:eastAsia="Times New Roman" w:hAnsi="Consolas" w:cs="Times New Roman"/>
+          <w:color w:val="0000FF"/>
+          <w:kern w:val="0"/>
+          <w:sz w:val="21"/>
+          <w:szCs w:val="21"/>
+          <w14:ligatures w14:val="none"/>
+        </w:rPr>
+        <w:t>const</w:t>
+      </w:r>
+      <w:r>
+        <w:rPr>
+          <w:rFonts w:ascii="Consolas" w:eastAsia="Times New Roman" w:hAnsi="Consolas" w:cs="Times New Roman"/>
+          <w:color w:val="3B3B3B"/>
+          <w:kern w:val="0"/>
+          <w:sz w:val="21"/>
+          <w:szCs w:val="21"/>
+          <w14:ligatures w14:val="none"/>
+        </w:rPr>
+        <w:t xml:space="preserve"> </w:t>
+      </w:r>
+      <w:r>
+        <w:rPr>
+          <w:rFonts w:ascii="Consolas" w:eastAsia="Times New Roman" w:hAnsi="Consolas" w:cs="Times New Roman"/>
+          <w:color w:val="267F99"/>
+          <w:kern w:val="0"/>
+          <w:sz w:val="21"/>
+          <w:szCs w:val="21"/>
+          <w14:ligatures w14:val="none"/>
+        </w:rPr>
+        <w:t>crypto</w:t>
+      </w:r>
+      <w:r>
+        <w:rPr>
+          <w:rFonts w:ascii="Consolas" w:eastAsia="Times New Roman" w:hAnsi="Consolas" w:cs="Times New Roman"/>
+          <w:color w:val="3B3B3B"/>
+          <w:kern w:val="0"/>
+          <w:sz w:val="21"/>
+          <w:szCs w:val="21"/>
+          <w14:ligatures w14:val="none"/>
+        </w:rPr>
+        <w:t xml:space="preserve"> </w:t>
+      </w:r>
+      <w:r>
+        <w:rPr>
+          <w:rFonts w:ascii="Consolas" w:eastAsia="Times New Roman" w:hAnsi="Consolas" w:cs="Times New Roman"/>
+          <w:color w:val="000000"/>
+          <w:kern w:val="0"/>
+          <w:sz w:val="21"/>
+          <w:szCs w:val="21"/>
+          <w14:ligatures w14:val="none"/>
+        </w:rPr>
+        <w:t>=</w:t>
+      </w:r>
+      <w:r>
+        <w:rPr>
+          <w:rFonts w:ascii="Consolas" w:eastAsia="Times New Roman" w:hAnsi="Consolas" w:cs="Times New Roman"/>
+          <w:color w:val="3B3B3B"/>
+          <w:kern w:val="0"/>
+          <w:sz w:val="21"/>
+          <w:szCs w:val="21"/>
+          <w14:ligatures w14:val="none"/>
+        </w:rPr>
+        <w:t xml:space="preserve"> </w:t>
+      </w:r>
+      <w:r>
+        <w:rPr>
+          <w:rFonts w:ascii="Consolas" w:eastAsia="Times New Roman" w:hAnsi="Consolas" w:cs="Times New Roman"/>
+          <w:color w:val="795E26"/>
+          <w:kern w:val="0"/>
+          <w:sz w:val="21"/>
+          <w:szCs w:val="21"/>
+          <w14:ligatures w14:val="none"/>
+        </w:rPr>
+        <w:t>require</w:t>
+      </w:r>
+      <w:r>
+        <w:rPr>
+          <w:rFonts w:ascii="Consolas" w:eastAsia="Times New Roman" w:hAnsi="Consolas" w:cs="Times New Roman"/>
+          <w:color w:val="3B3B3B"/>
+          <w:kern w:val="0"/>
+          <w:sz w:val="21"/>
+          <w:szCs w:val="21"/>
+          <w14:ligatures w14:val="none"/>
+        </w:rPr>
+        <w:t>(</w:t>
+      </w:r>
+      <w:r>
+        <w:rPr>
+          <w:rFonts w:ascii="Consolas" w:eastAsia="Times New Roman" w:hAnsi="Consolas" w:cs="Times New Roman"/>
+          <w:color w:val="A31515"/>
+          <w:kern w:val="0"/>
+          <w:sz w:val="21"/>
+          <w:szCs w:val="21"/>
+          <w14:ligatures w14:val="none"/>
+        </w:rPr>
+        <w:t>'node:crypto'</w:t>
+      </w:r>
+      <w:r>
+        <w:rPr>
+          <w:rFonts w:ascii="Consolas" w:eastAsia="Times New Roman" w:hAnsi="Consolas" w:cs="Times New Roman"/>
+          <w:color w:val="3B3B3B"/>
+          <w:kern w:val="0"/>
+          <w:sz w:val="21"/>
+          <w:szCs w:val="21"/>
+          <w14:ligatures w14:val="none"/>
+        </w:rPr>
+        <w:t>)</w:t>
+      </w:r>
+    </w:p>
+    <w:p>
+      <w:pPr>
+        <w:shd w:val="clear" w:color="auto" w:fill="FFFFFF"/>
+        <w:spacing w:after="0" w:line="285" w:lineRule="atLeast"/>
+        <w:rPr>
+          <w:rFonts w:ascii="Consolas" w:eastAsia="Times New Roman" w:hAnsi="Consolas" w:cs="Times New Roman"/>
+          <w:color w:val="3B3B3B"/>
+          <w:kern w:val="0"/>
+          <w:sz w:val="21"/>
+          <w:szCs w:val="21"/>
+          <w14:ligatures w14:val="none"/>
+        </w:rPr>
+      </w:pPr>
+      <w:r>
+        <w:rPr>
+          <w:rFonts w:ascii="Consolas" w:eastAsia="Times New Roman" w:hAnsi="Consolas" w:cs="Times New Roman"/>
+          <w:color w:val="0000FF"/>
+          <w:kern w:val="0"/>
+          <w:sz w:val="21"/>
+          <w:szCs w:val="21"/>
+          <w14:ligatures w14:val="none"/>
+        </w:rPr>
+        <w:t>const</w:t>
+      </w:r>
+      <w:r>
+        <w:rPr>
+          <w:rFonts w:ascii="Consolas" w:eastAsia="Times New Roman" w:hAnsi="Consolas" w:cs="Times New Roman"/>
+          <w:color w:val="3B3B3B"/>
+          <w:kern w:val="0"/>
+          <w:sz w:val="21"/>
+          <w:szCs w:val="21"/>
+          <w14:ligatures w14:val="none"/>
+        </w:rPr>
+        <w:t xml:space="preserve"> { </w:t>
+      </w:r>
+      <w:r>
+        <w:rPr>
+          <w:rFonts w:ascii="Consolas" w:eastAsia="Times New Roman" w:hAnsi="Consolas" w:cs="Times New Roman"/>
+          <w:color w:val="795E26"/>
+          <w:kern w:val="0"/>
+          <w:sz w:val="21"/>
+          <w:szCs w:val="21"/>
+          <w14:ligatures w14:val="none"/>
+        </w:rPr>
+        <w:t>getData</w:t>
+      </w:r>
+      <w:r>
+        <w:rPr>
+          <w:rFonts w:ascii="Consolas" w:eastAsia="Times New Roman" w:hAnsi="Consolas" w:cs="Times New Roman"/>
+          <w:color w:val="3B3B3B"/>
+          <w:kern w:val="0"/>
+          <w:sz w:val="21"/>
+          <w:szCs w:val="21"/>
+          <w14:ligatures w14:val="none"/>
+        </w:rPr>
+        <w:t xml:space="preserve"> } </w:t>
+      </w:r>
+      <w:r>
+        <w:rPr>
+          <w:rFonts w:ascii="Consolas" w:eastAsia="Times New Roman" w:hAnsi="Consolas" w:cs="Times New Roman"/>
+          <w:color w:val="000000"/>
+          <w:kern w:val="0"/>
+          <w:sz w:val="21"/>
+          <w:szCs w:val="21"/>
+          <w14:ligatures w14:val="none"/>
+        </w:rPr>
+        <w:t>=</w:t>
+      </w:r>
+      <w:r>
+        <w:rPr>
+          <w:rFonts w:ascii="Consolas" w:eastAsia="Times New Roman" w:hAnsi="Consolas" w:cs="Times New Roman"/>
+          <w:color w:val="3B3B3B"/>
+          <w:kern w:val="0"/>
+          <w:sz w:val="21"/>
+          <w:szCs w:val="21"/>
+          <w14:ligatures w14:val="none"/>
+        </w:rPr>
+        <w:t xml:space="preserve"> </w:t>
+      </w:r>
+      <w:r>
+        <w:rPr>
+          <w:rFonts w:ascii="Consolas" w:eastAsia="Times New Roman" w:hAnsi="Consolas" w:cs="Times New Roman"/>
+          <w:color w:val="795E26"/>
+          <w:kern w:val="0"/>
+          <w:sz w:val="21"/>
+          <w:szCs w:val="21"/>
+          <w14:ligatures w14:val="none"/>
+        </w:rPr>
+        <w:t>require</w:t>
+      </w:r>
+      <w:r>
+        <w:rPr>
+          <w:rFonts w:ascii="Consolas" w:eastAsia="Times New Roman" w:hAnsi="Consolas" w:cs="Times New Roman"/>
+          <w:color w:val="3B3B3B"/>
+          <w:kern w:val="0"/>
+          <w:sz w:val="21"/>
+          <w:szCs w:val="21"/>
+          <w14:ligatures w14:val="none"/>
+        </w:rPr>
+        <w:t>(</w:t>
+      </w:r>
+      <w:r>
+        <w:rPr>
+          <w:rFonts w:ascii="Consolas" w:eastAsia="Times New Roman" w:hAnsi="Consolas" w:cs="Times New Roman"/>
+          <w:color w:val="A31515"/>
+          <w:kern w:val="0"/>
+          <w:sz w:val="21"/>
+          <w:szCs w:val="21"/>
+          <w14:ligatures w14:val="none"/>
+        </w:rPr>
+        <w:t>'../app'</w:t>
+      </w:r>
+      <w:r>
+        <w:rPr>
+          <w:rFonts w:ascii="Consolas" w:eastAsia="Times New Roman" w:hAnsi="Consolas" w:cs="Times New Roman"/>
+          <w:color w:val="3B3B3B"/>
+          <w:kern w:val="0"/>
+          <w:sz w:val="21"/>
+          <w:szCs w:val="21"/>
+          <w14:ligatures w14:val="none"/>
+        </w:rPr>
+        <w:t>)</w:t>
+      </w:r>
+    </w:p>
+    <w:p>
+      <w:pPr>
+        <w:shd w:val="clear" w:color="auto" w:fill="FFFFFF"/>
+        <w:spacing w:after="0" w:line="285" w:lineRule="atLeast"/>
+        <w:rPr>
+          <w:rFonts w:ascii="Consolas" w:eastAsia="Times New Roman" w:hAnsi="Consolas" w:cs="Times New Roman"/>
+          <w:color w:val="3B3B3B"/>
+          <w:kern w:val="0"/>
+          <w:sz w:val="21"/>
+          <w:szCs w:val="21"/>
+          <w14:ligatures w14:val="none"/>
+        </w:rPr>
+      </w:pPr>
+    </w:p>
+    <w:p>
+      <w:pPr>
+        <w:shd w:val="clear" w:color="auto" w:fill="FFFFFF"/>
+        <w:spacing w:after="0" w:line="285" w:lineRule="atLeast"/>
+        <w:rPr>
+          <w:rFonts w:ascii="Consolas" w:eastAsia="Times New Roman" w:hAnsi="Consolas" w:cs="Times New Roman"/>
+          <w:color w:val="3B3B3B"/>
+          <w:kern w:val="0"/>
+          <w:sz w:val="21"/>
+          <w:szCs w:val="21"/>
+          <w14:ligatures w14:val="none"/>
+        </w:rPr>
+      </w:pPr>
+      <w:r>
+        <w:rPr>
+          <w:rFonts w:ascii="Consolas" w:eastAsia="Times New Roman" w:hAnsi="Consolas" w:cs="Times New Roman"/>
+          <w:color w:val="267F99"/>
+          <w:kern w:val="0"/>
+          <w:sz w:val="21"/>
+          <w:szCs w:val="21"/>
+          <w14:ligatures w14:val="none"/>
+        </w:rPr>
+        <w:t>jest</w:t>
+      </w:r>
+      <w:r>
+        <w:rPr>
+          <w:rFonts w:ascii="Consolas" w:eastAsia="Times New Roman" w:hAnsi="Consolas" w:cs="Times New Roman"/>
+          <w:color w:val="3B3B3B"/>
+          <w:kern w:val="0"/>
+          <w:sz w:val="21"/>
+          <w:szCs w:val="21"/>
+          <w14:ligatures w14:val="none"/>
+        </w:rPr>
+        <w:t>.</w:t>
+      </w:r>
+      <w:r>
+        <w:rPr>
+          <w:rFonts w:ascii="Consolas" w:eastAsia="Times New Roman" w:hAnsi="Consolas" w:cs="Times New Roman"/>
+          <w:color w:val="795E26"/>
+          <w:kern w:val="0"/>
+          <w:sz w:val="21"/>
+          <w:szCs w:val="21"/>
+          <w14:ligatures w14:val="none"/>
+        </w:rPr>
+        <w:t>mock</w:t>
+      </w:r>
+      <w:r>
+        <w:rPr>
+          <w:rFonts w:ascii="Consolas" w:eastAsia="Times New Roman" w:hAnsi="Consolas" w:cs="Times New Roman"/>
+          <w:color w:val="3B3B3B"/>
+          <w:kern w:val="0"/>
+          <w:sz w:val="21"/>
+          <w:szCs w:val="21"/>
+          <w14:ligatures w14:val="none"/>
+        </w:rPr>
+        <w:t>(</w:t>
+      </w:r>
+      <w:r>
+        <w:rPr>
+          <w:rFonts w:ascii="Consolas" w:eastAsia="Times New Roman" w:hAnsi="Consolas" w:cs="Times New Roman"/>
+          <w:color w:val="A31515"/>
+          <w:kern w:val="0"/>
+          <w:sz w:val="21"/>
+          <w:szCs w:val="21"/>
+          <w14:ligatures w14:val="none"/>
+        </w:rPr>
+        <w:t>'node:crypto'</w:t>
+      </w:r>
+      <w:r>
+        <w:rPr>
+          <w:rFonts w:ascii="Consolas" w:eastAsia="Times New Roman" w:hAnsi="Consolas" w:cs="Times New Roman"/>
+          <w:color w:val="3B3B3B"/>
+          <w:kern w:val="0"/>
+          <w:sz w:val="21"/>
+          <w:szCs w:val="21"/>
+          <w14:ligatures w14:val="none"/>
+        </w:rPr>
+        <w:t>)</w:t>
+      </w:r>
+    </w:p>
+    <w:p>
+      <w:pPr>
+        <w:shd w:val="clear" w:color="auto" w:fill="FFFFFF"/>
+        <w:spacing w:after="0" w:line="285" w:lineRule="atLeast"/>
+        <w:rPr>
+          <w:rFonts w:ascii="Consolas" w:eastAsia="Times New Roman" w:hAnsi="Consolas" w:cs="Times New Roman"/>
+          <w:color w:val="3B3B3B"/>
+          <w:kern w:val="0"/>
+          <w:sz w:val="21"/>
+          <w:szCs w:val="21"/>
+          <w14:ligatures w14:val="none"/>
+        </w:rPr>
+      </w:pPr>
+    </w:p>
+    <w:p>
+      <w:pPr>
+        <w:shd w:val="clear" w:color="auto" w:fill="FFFFFF"/>
+        <w:spacing w:after="0" w:line="285" w:lineRule="atLeast"/>
+        <w:rPr>
+          <w:rFonts w:ascii="Consolas" w:eastAsia="Times New Roman" w:hAnsi="Consolas" w:cs="Times New Roman"/>
+          <w:color w:val="3B3B3B"/>
+          <w:kern w:val="0"/>
+          <w:sz w:val="21"/>
+          <w:szCs w:val="21"/>
+          <w14:ligatures w14:val="none"/>
+        </w:rPr>
+      </w:pPr>
+      <w:r>
+        <w:rPr>
+          <w:rFonts w:ascii="Consolas" w:eastAsia="Times New Roman" w:hAnsi="Consolas" w:cs="Times New Roman"/>
+          <w:color w:val="795E26"/>
+          <w:kern w:val="0"/>
+          <w:sz w:val="21"/>
+          <w:szCs w:val="21"/>
+          <w14:ligatures w14:val="none"/>
+        </w:rPr>
+        <w:t>test</w:t>
+      </w:r>
+      <w:r>
+        <w:rPr>
+          <w:rFonts w:ascii="Consolas" w:eastAsia="Times New Roman" w:hAnsi="Consolas" w:cs="Times New Roman"/>
+          <w:color w:val="3B3B3B"/>
+          <w:kern w:val="0"/>
+          <w:sz w:val="21"/>
+          <w:szCs w:val="21"/>
+          <w14:ligatures w14:val="none"/>
+        </w:rPr>
+        <w:t>(</w:t>
+      </w:r>
+      <w:r>
+        <w:rPr>
+          <w:rFonts w:ascii="Consolas" w:eastAsia="Times New Roman" w:hAnsi="Consolas" w:cs="Times New Roman"/>
+          <w:color w:val="A31515"/>
+          <w:kern w:val="0"/>
+          <w:sz w:val="21"/>
+          <w:szCs w:val="21"/>
+          <w14:ligatures w14:val="none"/>
+        </w:rPr>
+        <w:t>'Mocking function'</w:t>
+      </w:r>
+      <w:r>
+        <w:rPr>
+          <w:rFonts w:ascii="Consolas" w:eastAsia="Times New Roman" w:hAnsi="Consolas" w:cs="Times New Roman"/>
+          <w:color w:val="3B3B3B"/>
+          <w:kern w:val="0"/>
+          <w:sz w:val="21"/>
+          <w:szCs w:val="21"/>
+          <w14:ligatures w14:val="none"/>
+        </w:rPr>
+        <w:t xml:space="preserve">, </w:t>
+      </w:r>
+      <w:r>
+        <w:rPr>
+          <w:rFonts w:ascii="Consolas" w:eastAsia="Times New Roman" w:hAnsi="Consolas" w:cs="Times New Roman"/>
+          <w:color w:val="0000FF"/>
+          <w:kern w:val="0"/>
+          <w:sz w:val="21"/>
+          <w:szCs w:val="21"/>
+          <w14:ligatures w14:val="none"/>
+        </w:rPr>
+        <w:t>async</w:t>
+      </w:r>
+      <w:r>
+        <w:rPr>
+          <w:rFonts w:ascii="Consolas" w:eastAsia="Times New Roman" w:hAnsi="Consolas" w:cs="Times New Roman"/>
+          <w:color w:val="3B3B3B"/>
+          <w:kern w:val="0"/>
+          <w:sz w:val="21"/>
+          <w:szCs w:val="21"/>
+          <w14:ligatures w14:val="none"/>
+        </w:rPr>
+        <w:t xml:space="preserve"> () </w:t>
+      </w:r>
+      <w:r>
+        <w:rPr>
+          <w:rFonts w:ascii="Consolas" w:eastAsia="Times New Roman" w:hAnsi="Consolas" w:cs="Times New Roman"/>
+          <w:color w:val="0000FF"/>
+          <w:kern w:val="0"/>
+          <w:sz w:val="21"/>
+          <w:szCs w:val="21"/>
+          <w14:ligatures w14:val="none"/>
+        </w:rPr>
+        <w:t>=&gt;</w:t>
+      </w:r>
+      <w:r>
+        <w:rPr>
+          <w:rFonts w:ascii="Consolas" w:eastAsia="Times New Roman" w:hAnsi="Consolas" w:cs="Times New Roman"/>
+          <w:color w:val="3B3B3B"/>
+          <w:kern w:val="0"/>
+          <w:sz w:val="21"/>
+          <w:szCs w:val="21"/>
+          <w14:ligatures w14:val="none"/>
+        </w:rPr>
+        <w:t xml:space="preserve"> {</w:t>
+      </w:r>
+    </w:p>
+    <w:p>
+      <w:pPr>
+        <w:shd w:val="clear" w:color="auto" w:fill="FFFFFF"/>
+        <w:spacing w:after="0" w:line="285" w:lineRule="atLeast"/>
+        <w:rPr>
+          <w:rFonts w:ascii="Consolas" w:eastAsia="Times New Roman" w:hAnsi="Consolas" w:cs="Times New Roman"/>
+          <w:color w:val="3B3B3B"/>
+          <w:kern w:val="0"/>
+          <w:sz w:val="21"/>
+          <w:szCs w:val="21"/>
+          <w14:ligatures w14:val="none"/>
+        </w:rPr>
+      </w:pPr>
+      <w:r>
+        <w:rPr>
+          <w:rFonts w:ascii="Consolas" w:eastAsia="Times New Roman" w:hAnsi="Consolas" w:cs="Times New Roman"/>
+          <w:color w:val="3B3B3B"/>
+          <w:kern w:val="0"/>
+          <w:sz w:val="21"/>
+          <w:szCs w:val="21"/>
+          <w14:ligatures w14:val="none"/>
+        </w:rPr>
+        <w:t xml:space="preserve">    </w:t>
+      </w:r>
+      <w:r>
+        <w:rPr>
+          <w:rFonts w:ascii="Consolas" w:eastAsia="Times New Roman" w:hAnsi="Consolas" w:cs="Times New Roman"/>
+          <w:color w:val="267F99"/>
+          <w:kern w:val="0"/>
+          <w:sz w:val="21"/>
+          <w:szCs w:val="21"/>
+          <w14:ligatures w14:val="none"/>
+        </w:rPr>
+        <w:t>crypto</w:t>
+      </w:r>
+      <w:r>
+        <w:rPr>
+          <w:rFonts w:ascii="Consolas" w:eastAsia="Times New Roman" w:hAnsi="Consolas" w:cs="Times New Roman"/>
+          <w:color w:val="3B3B3B"/>
+          <w:kern w:val="0"/>
+          <w:sz w:val="21"/>
+          <w:szCs w:val="21"/>
+          <w14:ligatures w14:val="none"/>
+        </w:rPr>
+        <w:t>.</w:t>
+      </w:r>
+      <w:r>
+        <w:rPr>
+          <w:rFonts w:ascii="Consolas" w:eastAsia="Times New Roman" w:hAnsi="Consolas" w:cs="Times New Roman"/>
+          <w:color w:val="795E26"/>
+          <w:kern w:val="0"/>
+          <w:sz w:val="21"/>
+          <w:szCs w:val="21"/>
+          <w14:ligatures w14:val="none"/>
+        </w:rPr>
+        <w:t>randomBytes</w:t>
+      </w:r>
+      <w:r>
+        <w:rPr>
+          <w:rFonts w:ascii="Consolas" w:eastAsia="Times New Roman" w:hAnsi="Consolas" w:cs="Times New Roman"/>
+          <w:color w:val="3B3B3B"/>
+          <w:kern w:val="0"/>
+          <w:sz w:val="21"/>
+          <w:szCs w:val="21"/>
+          <w14:ligatures w14:val="none"/>
+        </w:rPr>
+        <w:t>.</w:t>
+      </w:r>
+      <w:r>
+        <w:rPr>
+          <w:rFonts w:ascii="Consolas" w:eastAsia="Times New Roman" w:hAnsi="Consolas" w:cs="Times New Roman"/>
+          <w:color w:val="795E26"/>
+          <w:kern w:val="0"/>
+          <w:sz w:val="21"/>
+          <w:szCs w:val="21"/>
+          <w14:ligatures w14:val="none"/>
+        </w:rPr>
+        <w:t>mockResolvedValueOnce</w:t>
+      </w:r>
+      <w:r>
+        <w:rPr>
+          <w:rFonts w:ascii="Consolas" w:eastAsia="Times New Roman" w:hAnsi="Consolas" w:cs="Times New Roman"/>
+          <w:color w:val="3B3B3B"/>
+          <w:kern w:val="0"/>
+          <w:sz w:val="21"/>
+          <w:szCs w:val="21"/>
+          <w14:ligatures w14:val="none"/>
+        </w:rPr>
+        <w:t>(</w:t>
+      </w:r>
+      <w:r>
+        <w:rPr>
+          <w:rFonts w:ascii="Consolas" w:eastAsia="Times New Roman" w:hAnsi="Consolas" w:cs="Times New Roman"/>
+          <w:color w:val="A31515"/>
+          <w:kern w:val="0"/>
+          <w:sz w:val="21"/>
+          <w:szCs w:val="21"/>
+          <w14:ligatures w14:val="none"/>
+        </w:rPr>
+        <w:t>'bytes'</w:t>
+      </w:r>
+      <w:r>
+        <w:rPr>
+          <w:rFonts w:ascii="Consolas" w:eastAsia="Times New Roman" w:hAnsi="Consolas" w:cs="Times New Roman"/>
+          <w:color w:val="3B3B3B"/>
+          <w:kern w:val="0"/>
+          <w:sz w:val="21"/>
+          <w:szCs w:val="21"/>
+          <w14:ligatures w14:val="none"/>
+        </w:rPr>
+        <w:t>)</w:t>
+      </w:r>
+    </w:p>
+    <w:p>
+      <w:pPr>
+        <w:shd w:val="clear" w:color="auto" w:fill="FFFFFF"/>
+        <w:spacing w:after="0" w:line="285" w:lineRule="atLeast"/>
+        <w:rPr>
+          <w:rFonts w:ascii="Consolas" w:eastAsia="Times New Roman" w:hAnsi="Consolas" w:cs="Times New Roman"/>
+          <w:color w:val="3B3B3B"/>
+          <w:kern w:val="0"/>
+          <w:sz w:val="21"/>
+          <w:szCs w:val="21"/>
+          <w14:ligatures w14:val="none"/>
+        </w:rPr>
+      </w:pPr>
+      <w:r>
+        <w:rPr>
+          <w:rFonts w:ascii="Consolas" w:eastAsia="Times New Roman" w:hAnsi="Consolas" w:cs="Times New Roman"/>
+          <w:color w:val="3B3B3B"/>
+          <w:kern w:val="0"/>
+          <w:sz w:val="21"/>
+          <w:szCs w:val="21"/>
+          <w14:ligatures w14:val="none"/>
+        </w:rPr>
+        <w:t xml:space="preserve">    </w:t>
+      </w:r>
+      <w:r>
+        <w:rPr>
+          <w:rFonts w:ascii="Consolas" w:eastAsia="Times New Roman" w:hAnsi="Consolas" w:cs="Times New Roman"/>
+          <w:color w:val="0000FF"/>
+          <w:kern w:val="0"/>
+          <w:sz w:val="21"/>
+          <w:szCs w:val="21"/>
+          <w14:ligatures w14:val="none"/>
+        </w:rPr>
+        <w:t>const</w:t>
+      </w:r>
+      <w:r>
+        <w:rPr>
+          <w:rFonts w:ascii="Consolas" w:eastAsia="Times New Roman" w:hAnsi="Consolas" w:cs="Times New Roman"/>
+          <w:color w:val="3B3B3B"/>
+          <w:kern w:val="0"/>
+          <w:sz w:val="21"/>
+          <w:szCs w:val="21"/>
+          <w14:ligatures w14:val="none"/>
+        </w:rPr>
+        <w:t xml:space="preserve"> </w:t>
+      </w:r>
+      <w:r>
+        <w:rPr>
+          <w:rFonts w:ascii="Consolas" w:eastAsia="Times New Roman" w:hAnsi="Consolas" w:cs="Times New Roman"/>
+          <w:color w:val="0070C1"/>
+          <w:kern w:val="0"/>
+          <w:sz w:val="21"/>
+          <w:szCs w:val="21"/>
+          <w14:ligatures w14:val="none"/>
+        </w:rPr>
+        <w:t>res</w:t>
+      </w:r>
+      <w:r>
+        <w:rPr>
+          <w:rFonts w:ascii="Consolas" w:eastAsia="Times New Roman" w:hAnsi="Consolas" w:cs="Times New Roman"/>
+          <w:color w:val="3B3B3B"/>
+          <w:kern w:val="0"/>
+          <w:sz w:val="21"/>
+          <w:szCs w:val="21"/>
+          <w14:ligatures w14:val="none"/>
+        </w:rPr>
+        <w:t xml:space="preserve"> </w:t>
+      </w:r>
+      <w:r>
+        <w:rPr>
+          <w:rFonts w:ascii="Consolas" w:eastAsia="Times New Roman" w:hAnsi="Consolas" w:cs="Times New Roman"/>
+          <w:color w:val="000000"/>
+          <w:kern w:val="0"/>
+          <w:sz w:val="21"/>
+          <w:szCs w:val="21"/>
+          <w14:ligatures w14:val="none"/>
+        </w:rPr>
+        <w:t>=</w:t>
+      </w:r>
+      <w:r>
+        <w:rPr>
+          <w:rFonts w:ascii="Consolas" w:eastAsia="Times New Roman" w:hAnsi="Consolas" w:cs="Times New Roman"/>
+          <w:color w:val="3B3B3B"/>
+          <w:kern w:val="0"/>
+          <w:sz w:val="21"/>
+          <w:szCs w:val="21"/>
+          <w14:ligatures w14:val="none"/>
+        </w:rPr>
+        <w:t xml:space="preserve"> </w:t>
+      </w:r>
+      <w:r>
+        <w:rPr>
+          <w:rFonts w:ascii="Consolas" w:eastAsia="Times New Roman" w:hAnsi="Consolas" w:cs="Times New Roman"/>
+          <w:color w:val="AF00DB"/>
+          <w:kern w:val="0"/>
+          <w:sz w:val="21"/>
+          <w:szCs w:val="21"/>
+          <w14:ligatures w14:val="none"/>
+        </w:rPr>
+        <w:t>await</w:t>
+      </w:r>
+      <w:r>
+        <w:rPr>
+          <w:rFonts w:ascii="Consolas" w:eastAsia="Times New Roman" w:hAnsi="Consolas" w:cs="Times New Roman"/>
+          <w:color w:val="3B3B3B"/>
+          <w:kern w:val="0"/>
+          <w:sz w:val="21"/>
+          <w:szCs w:val="21"/>
+          <w14:ligatures w14:val="none"/>
+        </w:rPr>
+        <w:t xml:space="preserve"> </w:t>
+      </w:r>
+      <w:r>
+        <w:rPr>
+          <w:rFonts w:ascii="Consolas" w:eastAsia="Times New Roman" w:hAnsi="Consolas" w:cs="Times New Roman"/>
+          <w:color w:val="795E26"/>
+          <w:kern w:val="0"/>
+          <w:sz w:val="21"/>
+          <w:szCs w:val="21"/>
+          <w14:ligatures w14:val="none"/>
+        </w:rPr>
+        <w:t>getData</w:t>
+      </w:r>
+      <w:r>
+        <w:rPr>
+          <w:rFonts w:ascii="Consolas" w:eastAsia="Times New Roman" w:hAnsi="Consolas" w:cs="Times New Roman"/>
+          <w:color w:val="3B3B3B"/>
+          <w:kern w:val="0"/>
+          <w:sz w:val="21"/>
+          <w:szCs w:val="21"/>
+          <w14:ligatures w14:val="none"/>
+        </w:rPr>
+        <w:t>()</w:t>
+      </w:r>
+    </w:p>
+    <w:p>
+      <w:pPr>
+        <w:shd w:val="clear" w:color="auto" w:fill="FFFFFF"/>
+        <w:spacing w:after="0" w:line="285" w:lineRule="atLeast"/>
+        <w:rPr>
+          <w:rFonts w:ascii="Consolas" w:eastAsia="Times New Roman" w:hAnsi="Consolas" w:cs="Times New Roman"/>
+          <w:color w:val="3B3B3B"/>
+          <w:kern w:val="0"/>
+          <w:sz w:val="21"/>
+          <w:szCs w:val="21"/>
+          <w14:ligatures w14:val="none"/>
+        </w:rPr>
+      </w:pPr>
+      <w:r>
+        <w:rPr>
+          <w:rFonts w:ascii="Consolas" w:eastAsia="Times New Roman" w:hAnsi="Consolas" w:cs="Times New Roman"/>
+          <w:color w:val="3B3B3B"/>
+          <w:kern w:val="0"/>
+          <w:sz w:val="21"/>
+          <w:szCs w:val="21"/>
+          <w14:ligatures w14:val="none"/>
+        </w:rPr>
+        <w:t xml:space="preserve">    </w:t>
+      </w:r>
+      <w:r>
+        <w:rPr>
+          <w:rFonts w:ascii="Consolas" w:eastAsia="Times New Roman" w:hAnsi="Consolas" w:cs="Times New Roman"/>
+          <w:color w:val="795E26"/>
+          <w:kern w:val="0"/>
+          <w:sz w:val="21"/>
+          <w:szCs w:val="21"/>
+          <w14:ligatures w14:val="none"/>
+        </w:rPr>
+        <w:t>expect</w:t>
+      </w:r>
+      <w:r>
+        <w:rPr>
+          <w:rFonts w:ascii="Consolas" w:eastAsia="Times New Roman" w:hAnsi="Consolas" w:cs="Times New Roman"/>
+          <w:color w:val="3B3B3B"/>
+          <w:kern w:val="0"/>
+          <w:sz w:val="21"/>
+          <w:szCs w:val="21"/>
+          <w14:ligatures w14:val="none"/>
+        </w:rPr>
+        <w:t>(</w:t>
+      </w:r>
+      <w:r>
+        <w:rPr>
+          <w:rFonts w:ascii="Consolas" w:eastAsia="Times New Roman" w:hAnsi="Consolas" w:cs="Times New Roman"/>
+          <w:color w:val="0070C1"/>
+          <w:kern w:val="0"/>
+          <w:sz w:val="21"/>
+          <w:szCs w:val="21"/>
+          <w14:ligatures w14:val="none"/>
+        </w:rPr>
+        <w:t>res</w:t>
+      </w:r>
+      <w:r>
+        <w:rPr>
+          <w:rFonts w:ascii="Consolas" w:eastAsia="Times New Roman" w:hAnsi="Consolas" w:cs="Times New Roman"/>
+          <w:color w:val="3B3B3B"/>
+          <w:kern w:val="0"/>
+          <w:sz w:val="21"/>
+          <w:szCs w:val="21"/>
+          <w14:ligatures w14:val="none"/>
+        </w:rPr>
+        <w:t>).</w:t>
+      </w:r>
+      <w:r>
+        <w:rPr>
+          <w:rFonts w:ascii="Consolas" w:eastAsia="Times New Roman" w:hAnsi="Consolas" w:cs="Times New Roman"/>
+          <w:color w:val="795E26"/>
+          <w:kern w:val="0"/>
+          <w:sz w:val="21"/>
+          <w:szCs w:val="21"/>
+          <w14:ligatures w14:val="none"/>
+        </w:rPr>
+        <w:t>toEqual</w:t>
+      </w:r>
+      <w:r>
+        <w:rPr>
+          <w:rFonts w:ascii="Consolas" w:eastAsia="Times New Roman" w:hAnsi="Consolas" w:cs="Times New Roman"/>
+          <w:color w:val="3B3B3B"/>
+          <w:kern w:val="0"/>
+          <w:sz w:val="21"/>
+          <w:szCs w:val="21"/>
+          <w14:ligatures w14:val="none"/>
+        </w:rPr>
+        <w:t>(</w:t>
+      </w:r>
+      <w:r>
+        <w:rPr>
+          <w:rFonts w:ascii="Consolas" w:eastAsia="Times New Roman" w:hAnsi="Consolas" w:cs="Times New Roman"/>
+          <w:color w:val="A31515"/>
+          <w:kern w:val="0"/>
+          <w:sz w:val="21"/>
+          <w:szCs w:val="21"/>
+          <w14:ligatures w14:val="none"/>
+        </w:rPr>
+        <w:t>'bytes'</w:t>
+      </w:r>
+      <w:r>
+        <w:rPr>
+          <w:rFonts w:ascii="Consolas" w:eastAsia="Times New Roman" w:hAnsi="Consolas" w:cs="Times New Roman"/>
+          <w:color w:val="3B3B3B"/>
+          <w:kern w:val="0"/>
+          <w:sz w:val="21"/>
+          <w:szCs w:val="21"/>
+          <w14:ligatures w14:val="none"/>
+        </w:rPr>
+        <w:t>)</w:t>
+      </w:r>
+    </w:p>
+    <w:p>
+      <w:pPr>
+        <w:shd w:val="clear" w:color="auto" w:fill="FFFFFF"/>
+        <w:spacing w:after="0" w:line="285" w:lineRule="atLeast"/>
+        <w:rPr>
+          <w:rFonts w:ascii="Consolas" w:eastAsia="Times New Roman" w:hAnsi="Consolas" w:cs="Times New Roman"/>
+          <w:color w:val="3B3B3B"/>
+          <w:kern w:val="0"/>
+          <w:sz w:val="21"/>
+          <w:szCs w:val="21"/>
+          <w14:ligatures w14:val="none"/>
+        </w:rPr>
+      </w:pPr>
+      <w:r>
+        <w:rPr>
+          <w:rFonts w:ascii="Consolas" w:eastAsia="Times New Roman" w:hAnsi="Consolas" w:cs="Times New Roman"/>
+          <w:color w:val="3B3B3B"/>
+          <w:kern w:val="0"/>
+          <w:sz w:val="21"/>
+          <w:szCs w:val="21"/>
+          <w14:ligatures w14:val="none"/>
+        </w:rPr>
+        <w:t>})</w:t>
+      </w:r>
+    </w:p>
+    <w:p>
+      <w:pPr>
+        <w:ind w:firstLine="720"/>
+      </w:pPr>
+      <w:r>
+        <w:t>-----------------------------------------------------------------------------</w:t>
+      </w:r>
+    </w:p>
+    <w:p>
+      <w:pPr>
+        <w:shd w:val="clear" w:color="auto" w:fill="FFFFFF"/>
+        <w:spacing w:after="0" w:line="285" w:lineRule="atLeast"/>
+        <w:rPr>
+          <w:rFonts w:ascii="Consolas" w:eastAsia="Times New Roman" w:hAnsi="Consolas" w:cs="Times New Roman"/>
+          <w:color w:val="795E26"/>
+          <w:kern w:val="0"/>
+          <w:sz w:val="21"/>
+          <w:szCs w:val="21"/>
+          <w14:ligatures w14:val="none"/>
+        </w:rPr>
+      </w:pPr>
+    </w:p>
+    <w:p>
+      <w:pPr>
+        <w:shd w:val="clear" w:color="auto" w:fill="FFFFFF"/>
+        <w:spacing w:after="0" w:line="285" w:lineRule="atLeast"/>
+        <w:rPr>
+          <w:rFonts w:ascii="Consolas" w:eastAsia="Times New Roman" w:hAnsi="Consolas" w:cs="Times New Roman"/>
+          <w:color w:val="795E26"/>
+          <w:kern w:val="0"/>
+          <w:sz w:val="21"/>
+          <w:szCs w:val="21"/>
+          <w14:ligatures w14:val="none"/>
+        </w:rPr>
+      </w:pPr>
+    </w:p>
+    <w:p>
+      <w:pPr>
+        <w:shd w:val="clear" w:color="auto" w:fill="FFFFFF"/>
+        <w:spacing w:after="0" w:line="285" w:lineRule="atLeast"/>
+        <w:rPr>
+          <w:rFonts w:ascii="Consolas" w:eastAsia="Times New Roman" w:hAnsi="Consolas" w:cs="Times New Roman"/>
+          <w:color w:val="3B3B3B"/>
+          <w:kern w:val="0"/>
+          <w:sz w:val="21"/>
+          <w:szCs w:val="21"/>
+          <w14:ligatures w14:val="none"/>
+        </w:rPr>
+      </w:pPr>
+      <w:r>
+        <w:rPr>
+          <w:rFonts w:ascii="Consolas" w:eastAsia="Times New Roman" w:hAnsi="Consolas" w:cs="Times New Roman"/>
+          <w:color w:val="795E26"/>
+          <w:kern w:val="0"/>
+          <w:sz w:val="21"/>
+          <w:szCs w:val="21"/>
+          <w14:ligatures w14:val="none"/>
+        </w:rPr>
+        <w:lastRenderedPageBreak/>
+        <w:t>test</w:t>
+      </w:r>
+      <w:r>
+        <w:rPr>
+          <w:rFonts w:ascii="Consolas" w:eastAsia="Times New Roman" w:hAnsi="Consolas" w:cs="Times New Roman"/>
+          <w:color w:val="3B3B3B"/>
+          <w:kern w:val="0"/>
+          <w:sz w:val="21"/>
+          <w:szCs w:val="21"/>
+          <w14:ligatures w14:val="none"/>
+        </w:rPr>
+        <w:t>(</w:t>
+      </w:r>
+      <w:r>
+        <w:rPr>
+          <w:rFonts w:ascii="Consolas" w:eastAsia="Times New Roman" w:hAnsi="Consolas" w:cs="Times New Roman"/>
+          <w:color w:val="A31515"/>
+          <w:kern w:val="0"/>
+          <w:sz w:val="21"/>
+          <w:szCs w:val="21"/>
+          <w14:ligatures w14:val="none"/>
+        </w:rPr>
+        <w:t>'Mocking function'</w:t>
+      </w:r>
+      <w:r>
+        <w:rPr>
+          <w:rFonts w:ascii="Consolas" w:eastAsia="Times New Roman" w:hAnsi="Consolas" w:cs="Times New Roman"/>
+          <w:color w:val="3B3B3B"/>
+          <w:kern w:val="0"/>
+          <w:sz w:val="21"/>
+          <w:szCs w:val="21"/>
+          <w14:ligatures w14:val="none"/>
+        </w:rPr>
+        <w:t xml:space="preserve">, </w:t>
+      </w:r>
+      <w:r>
+        <w:rPr>
+          <w:rFonts w:ascii="Consolas" w:eastAsia="Times New Roman" w:hAnsi="Consolas" w:cs="Times New Roman"/>
+          <w:color w:val="0000FF"/>
+          <w:kern w:val="0"/>
+          <w:sz w:val="21"/>
+          <w:szCs w:val="21"/>
+          <w14:ligatures w14:val="none"/>
+        </w:rPr>
+        <w:t>async</w:t>
+      </w:r>
+      <w:r>
+        <w:rPr>
+          <w:rFonts w:ascii="Consolas" w:eastAsia="Times New Roman" w:hAnsi="Consolas" w:cs="Times New Roman"/>
+          <w:color w:val="3B3B3B"/>
+          <w:kern w:val="0"/>
+          <w:sz w:val="21"/>
+          <w:szCs w:val="21"/>
+          <w14:ligatures w14:val="none"/>
+        </w:rPr>
+        <w:t xml:space="preserve"> () </w:t>
+      </w:r>
+      <w:r>
+        <w:rPr>
+          <w:rFonts w:ascii="Consolas" w:eastAsia="Times New Roman" w:hAnsi="Consolas" w:cs="Times New Roman"/>
+          <w:color w:val="0000FF"/>
+          <w:kern w:val="0"/>
+          <w:sz w:val="21"/>
+          <w:szCs w:val="21"/>
+          <w14:ligatures w14:val="none"/>
+        </w:rPr>
+        <w:t>=&gt;</w:t>
+      </w:r>
+      <w:r>
+        <w:rPr>
+          <w:rFonts w:ascii="Consolas" w:eastAsia="Times New Roman" w:hAnsi="Consolas" w:cs="Times New Roman"/>
+          <w:color w:val="3B3B3B"/>
+          <w:kern w:val="0"/>
+          <w:sz w:val="21"/>
+          <w:szCs w:val="21"/>
+          <w14:ligatures w14:val="none"/>
+        </w:rPr>
+        <w:t xml:space="preserve"> {</w:t>
+      </w:r>
+    </w:p>
+    <w:p>
+      <w:pPr>
+        <w:shd w:val="clear" w:color="auto" w:fill="FFFFFF"/>
+        <w:spacing w:after="0" w:line="285" w:lineRule="atLeast"/>
+        <w:rPr>
+          <w:rFonts w:ascii="Consolas" w:eastAsia="Times New Roman" w:hAnsi="Consolas" w:cs="Times New Roman"/>
+          <w:color w:val="3B3B3B"/>
+          <w:kern w:val="0"/>
+          <w:sz w:val="21"/>
+          <w:szCs w:val="21"/>
+          <w14:ligatures w14:val="none"/>
+        </w:rPr>
+      </w:pPr>
+      <w:r>
+        <w:rPr>
+          <w:rFonts w:ascii="Consolas" w:eastAsia="Times New Roman" w:hAnsi="Consolas" w:cs="Times New Roman"/>
+          <w:color w:val="3B3B3B"/>
+          <w:kern w:val="0"/>
+          <w:sz w:val="21"/>
+          <w:szCs w:val="21"/>
+          <w14:ligatures w14:val="none"/>
+        </w:rPr>
+        <w:t xml:space="preserve">    </w:t>
+      </w:r>
+      <w:r>
+        <w:rPr>
+          <w:rFonts w:ascii="Consolas" w:eastAsia="Times New Roman" w:hAnsi="Consolas" w:cs="Times New Roman"/>
+          <w:color w:val="267F99"/>
+          <w:kern w:val="0"/>
+          <w:sz w:val="21"/>
+          <w:szCs w:val="21"/>
+          <w14:ligatures w14:val="none"/>
+        </w:rPr>
+        <w:t>crypto</w:t>
+      </w:r>
+      <w:r>
+        <w:rPr>
+          <w:rFonts w:ascii="Consolas" w:eastAsia="Times New Roman" w:hAnsi="Consolas" w:cs="Times New Roman"/>
+          <w:color w:val="3B3B3B"/>
+          <w:kern w:val="0"/>
+          <w:sz w:val="21"/>
+          <w:szCs w:val="21"/>
+          <w14:ligatures w14:val="none"/>
+        </w:rPr>
+        <w:t>.</w:t>
+      </w:r>
+      <w:r>
+        <w:rPr>
+          <w:rFonts w:ascii="Consolas" w:eastAsia="Times New Roman" w:hAnsi="Consolas" w:cs="Times New Roman"/>
+          <w:color w:val="795E26"/>
+          <w:kern w:val="0"/>
+          <w:sz w:val="21"/>
+          <w:szCs w:val="21"/>
+          <w14:ligatures w14:val="none"/>
+        </w:rPr>
+        <w:t>randomBytes</w:t>
+      </w:r>
+      <w:r>
+        <w:rPr>
+          <w:rFonts w:ascii="Consolas" w:eastAsia="Times New Roman" w:hAnsi="Consolas" w:cs="Times New Roman"/>
+          <w:color w:val="3B3B3B"/>
+          <w:kern w:val="0"/>
+          <w:sz w:val="21"/>
+          <w:szCs w:val="21"/>
+          <w14:ligatures w14:val="none"/>
+        </w:rPr>
+        <w:t>.</w:t>
+      </w:r>
+      <w:r>
+        <w:rPr>
+          <w:rFonts w:ascii="Consolas" w:eastAsia="Times New Roman" w:hAnsi="Consolas" w:cs="Times New Roman"/>
+          <w:color w:val="795E26"/>
+          <w:kern w:val="0"/>
+          <w:sz w:val="21"/>
+          <w:szCs w:val="21"/>
+          <w14:ligatures w14:val="none"/>
+        </w:rPr>
+        <w:t>mockImplementationOnce</w:t>
+      </w:r>
+      <w:r>
+        <w:rPr>
+          <w:rFonts w:ascii="Consolas" w:eastAsia="Times New Roman" w:hAnsi="Consolas" w:cs="Times New Roman"/>
+          <w:color w:val="3B3B3B"/>
+          <w:kern w:val="0"/>
+          <w:sz w:val="21"/>
+          <w:szCs w:val="21"/>
+          <w14:ligatures w14:val="none"/>
+        </w:rPr>
+        <w:t xml:space="preserve">(() </w:t>
+      </w:r>
+      <w:r>
+        <w:rPr>
+          <w:rFonts w:ascii="Consolas" w:eastAsia="Times New Roman" w:hAnsi="Consolas" w:cs="Times New Roman"/>
+          <w:color w:val="0000FF"/>
+          <w:kern w:val="0"/>
+          <w:sz w:val="21"/>
+          <w:szCs w:val="21"/>
+          <w14:ligatures w14:val="none"/>
+        </w:rPr>
+        <w:t>=&gt;</w:t>
+      </w:r>
+      <w:r>
+        <w:rPr>
+          <w:rFonts w:ascii="Consolas" w:eastAsia="Times New Roman" w:hAnsi="Consolas" w:cs="Times New Roman"/>
+          <w:color w:val="3B3B3B"/>
+          <w:kern w:val="0"/>
+          <w:sz w:val="21"/>
+          <w:szCs w:val="21"/>
+          <w14:ligatures w14:val="none"/>
+        </w:rPr>
+        <w:t xml:space="preserve"> </w:t>
+      </w:r>
+      <w:r>
+        <w:rPr>
+          <w:rFonts w:ascii="Consolas" w:eastAsia="Times New Roman" w:hAnsi="Consolas" w:cs="Times New Roman"/>
+          <w:color w:val="267F99"/>
+          <w:kern w:val="0"/>
+          <w:sz w:val="21"/>
+          <w:szCs w:val="21"/>
+          <w14:ligatures w14:val="none"/>
+        </w:rPr>
+        <w:t>Promise</w:t>
+      </w:r>
+      <w:r>
+        <w:rPr>
+          <w:rFonts w:ascii="Consolas" w:eastAsia="Times New Roman" w:hAnsi="Consolas" w:cs="Times New Roman"/>
+          <w:color w:val="3B3B3B"/>
+          <w:kern w:val="0"/>
+          <w:sz w:val="21"/>
+          <w:szCs w:val="21"/>
+          <w14:ligatures w14:val="none"/>
+        </w:rPr>
+        <w:t>.</w:t>
+      </w:r>
+      <w:r>
+        <w:rPr>
+          <w:rFonts w:ascii="Consolas" w:eastAsia="Times New Roman" w:hAnsi="Consolas" w:cs="Times New Roman"/>
+          <w:color w:val="795E26"/>
+          <w:kern w:val="0"/>
+          <w:sz w:val="21"/>
+          <w:szCs w:val="21"/>
+          <w14:ligatures w14:val="none"/>
+        </w:rPr>
+        <w:t>resolve</w:t>
+      </w:r>
+      <w:r>
+        <w:rPr>
+          <w:rFonts w:ascii="Consolas" w:eastAsia="Times New Roman" w:hAnsi="Consolas" w:cs="Times New Roman"/>
+          <w:color w:val="3B3B3B"/>
+          <w:kern w:val="0"/>
+          <w:sz w:val="21"/>
+          <w:szCs w:val="21"/>
+          <w14:ligatures w14:val="none"/>
+        </w:rPr>
+        <w:t>(</w:t>
+      </w:r>
+      <w:r>
+        <w:rPr>
+          <w:rFonts w:ascii="Consolas" w:eastAsia="Times New Roman" w:hAnsi="Consolas" w:cs="Times New Roman"/>
+          <w:color w:val="A31515"/>
+          <w:kern w:val="0"/>
+          <w:sz w:val="21"/>
+          <w:szCs w:val="21"/>
+          <w14:ligatures w14:val="none"/>
+        </w:rPr>
+        <w:t>'bytes'</w:t>
+      </w:r>
+      <w:r>
+        <w:rPr>
+          <w:rFonts w:ascii="Consolas" w:eastAsia="Times New Roman" w:hAnsi="Consolas" w:cs="Times New Roman"/>
+          <w:color w:val="3B3B3B"/>
+          <w:kern w:val="0"/>
+          <w:sz w:val="21"/>
+          <w:szCs w:val="21"/>
+          <w14:ligatures w14:val="none"/>
+        </w:rPr>
+        <w:t>))</w:t>
+      </w:r>
+    </w:p>
+    <w:p>
+      <w:pPr>
+        <w:shd w:val="clear" w:color="auto" w:fill="FFFFFF"/>
+        <w:spacing w:after="0" w:line="285" w:lineRule="atLeast"/>
+        <w:rPr>
+          <w:rFonts w:ascii="Consolas" w:eastAsia="Times New Roman" w:hAnsi="Consolas" w:cs="Times New Roman"/>
+          <w:color w:val="3B3B3B"/>
+          <w:kern w:val="0"/>
+          <w:sz w:val="21"/>
+          <w:szCs w:val="21"/>
+          <w14:ligatures w14:val="none"/>
+        </w:rPr>
+      </w:pPr>
+      <w:r>
+        <w:rPr>
+          <w:rFonts w:ascii="Consolas" w:eastAsia="Times New Roman" w:hAnsi="Consolas" w:cs="Times New Roman"/>
+          <w:color w:val="3B3B3B"/>
+          <w:kern w:val="0"/>
+          <w:sz w:val="21"/>
+          <w:szCs w:val="21"/>
+          <w14:ligatures w14:val="none"/>
+        </w:rPr>
+        <w:t xml:space="preserve">    </w:t>
+      </w:r>
+      <w:r>
+        <w:rPr>
+          <w:rFonts w:ascii="Consolas" w:eastAsia="Times New Roman" w:hAnsi="Consolas" w:cs="Times New Roman"/>
+          <w:color w:val="0000FF"/>
+          <w:kern w:val="0"/>
+          <w:sz w:val="21"/>
+          <w:szCs w:val="21"/>
+          <w14:ligatures w14:val="none"/>
+        </w:rPr>
+        <w:t>const</w:t>
+      </w:r>
+      <w:r>
+        <w:rPr>
+          <w:rFonts w:ascii="Consolas" w:eastAsia="Times New Roman" w:hAnsi="Consolas" w:cs="Times New Roman"/>
+          <w:color w:val="3B3B3B"/>
+          <w:kern w:val="0"/>
+          <w:sz w:val="21"/>
+          <w:szCs w:val="21"/>
+          <w14:ligatures w14:val="none"/>
+        </w:rPr>
+        <w:t xml:space="preserve"> </w:t>
+      </w:r>
+      <w:r>
+        <w:rPr>
+          <w:rFonts w:ascii="Consolas" w:eastAsia="Times New Roman" w:hAnsi="Consolas" w:cs="Times New Roman"/>
+          <w:color w:val="0070C1"/>
+          <w:kern w:val="0"/>
+          <w:sz w:val="21"/>
+          <w:szCs w:val="21"/>
+          <w14:ligatures w14:val="none"/>
+        </w:rPr>
+        <w:t>res</w:t>
+      </w:r>
+      <w:r>
+        <w:rPr>
+          <w:rFonts w:ascii="Consolas" w:eastAsia="Times New Roman" w:hAnsi="Consolas" w:cs="Times New Roman"/>
+          <w:color w:val="3B3B3B"/>
+          <w:kern w:val="0"/>
+          <w:sz w:val="21"/>
+          <w:szCs w:val="21"/>
+          <w14:ligatures w14:val="none"/>
+        </w:rPr>
+        <w:t xml:space="preserve"> </w:t>
+      </w:r>
+      <w:r>
+        <w:rPr>
+          <w:rFonts w:ascii="Consolas" w:eastAsia="Times New Roman" w:hAnsi="Consolas" w:cs="Times New Roman"/>
+          <w:color w:val="000000"/>
+          <w:kern w:val="0"/>
+          <w:sz w:val="21"/>
+          <w:szCs w:val="21"/>
+          <w14:ligatures w14:val="none"/>
+        </w:rPr>
+        <w:t>=</w:t>
+      </w:r>
+      <w:r>
+        <w:rPr>
+          <w:rFonts w:ascii="Consolas" w:eastAsia="Times New Roman" w:hAnsi="Consolas" w:cs="Times New Roman"/>
+          <w:color w:val="3B3B3B"/>
+          <w:kern w:val="0"/>
+          <w:sz w:val="21"/>
+          <w:szCs w:val="21"/>
+          <w14:ligatures w14:val="none"/>
+        </w:rPr>
+        <w:t xml:space="preserve"> </w:t>
+      </w:r>
+      <w:r>
+        <w:rPr>
+          <w:rFonts w:ascii="Consolas" w:eastAsia="Times New Roman" w:hAnsi="Consolas" w:cs="Times New Roman"/>
+          <w:color w:val="AF00DB"/>
+          <w:kern w:val="0"/>
+          <w:sz w:val="21"/>
+          <w:szCs w:val="21"/>
+          <w14:ligatures w14:val="none"/>
+        </w:rPr>
+        <w:t>await</w:t>
+      </w:r>
+      <w:r>
+        <w:rPr>
+          <w:rFonts w:ascii="Consolas" w:eastAsia="Times New Roman" w:hAnsi="Consolas" w:cs="Times New Roman"/>
+          <w:color w:val="3B3B3B"/>
+          <w:kern w:val="0"/>
+          <w:sz w:val="21"/>
+          <w:szCs w:val="21"/>
+          <w14:ligatures w14:val="none"/>
+        </w:rPr>
+        <w:t xml:space="preserve"> </w:t>
+      </w:r>
+      <w:r>
+        <w:rPr>
+          <w:rFonts w:ascii="Consolas" w:eastAsia="Times New Roman" w:hAnsi="Consolas" w:cs="Times New Roman"/>
+          <w:color w:val="795E26"/>
+          <w:kern w:val="0"/>
+          <w:sz w:val="21"/>
+          <w:szCs w:val="21"/>
+          <w14:ligatures w14:val="none"/>
+        </w:rPr>
+        <w:t>getData</w:t>
+      </w:r>
+      <w:r>
+        <w:rPr>
+          <w:rFonts w:ascii="Consolas" w:eastAsia="Times New Roman" w:hAnsi="Consolas" w:cs="Times New Roman"/>
+          <w:color w:val="3B3B3B"/>
+          <w:kern w:val="0"/>
+          <w:sz w:val="21"/>
+          <w:szCs w:val="21"/>
+          <w14:ligatures w14:val="none"/>
+        </w:rPr>
+        <w:t>()</w:t>
+      </w:r>
+    </w:p>
+    <w:p>
+      <w:pPr>
+        <w:shd w:val="clear" w:color="auto" w:fill="FFFFFF"/>
+        <w:spacing w:after="0" w:line="285" w:lineRule="atLeast"/>
+        <w:rPr>
+          <w:rFonts w:ascii="Consolas" w:eastAsia="Times New Roman" w:hAnsi="Consolas" w:cs="Times New Roman"/>
+          <w:color w:val="3B3B3B"/>
+          <w:kern w:val="0"/>
+          <w:sz w:val="21"/>
+          <w:szCs w:val="21"/>
+          <w14:ligatures w14:val="none"/>
+        </w:rPr>
+      </w:pPr>
+      <w:r>
+        <w:rPr>
+          <w:rFonts w:ascii="Consolas" w:eastAsia="Times New Roman" w:hAnsi="Consolas" w:cs="Times New Roman"/>
+          <w:color w:val="3B3B3B"/>
+          <w:kern w:val="0"/>
+          <w:sz w:val="21"/>
+          <w:szCs w:val="21"/>
+          <w14:ligatures w14:val="none"/>
+        </w:rPr>
+        <w:t xml:space="preserve">    </w:t>
+      </w:r>
+      <w:r>
+        <w:rPr>
+          <w:rFonts w:ascii="Consolas" w:eastAsia="Times New Roman" w:hAnsi="Consolas" w:cs="Times New Roman"/>
+          <w:color w:val="795E26"/>
+          <w:kern w:val="0"/>
+          <w:sz w:val="21"/>
+          <w:szCs w:val="21"/>
+          <w14:ligatures w14:val="none"/>
+        </w:rPr>
+        <w:t>expect</w:t>
+      </w:r>
+      <w:r>
+        <w:rPr>
+          <w:rFonts w:ascii="Consolas" w:eastAsia="Times New Roman" w:hAnsi="Consolas" w:cs="Times New Roman"/>
+          <w:color w:val="3B3B3B"/>
+          <w:kern w:val="0"/>
+          <w:sz w:val="21"/>
+          <w:szCs w:val="21"/>
+          <w14:ligatures w14:val="none"/>
+        </w:rPr>
+        <w:t>(</w:t>
+      </w:r>
+      <w:r>
+        <w:rPr>
+          <w:rFonts w:ascii="Consolas" w:eastAsia="Times New Roman" w:hAnsi="Consolas" w:cs="Times New Roman"/>
+          <w:color w:val="0070C1"/>
+          <w:kern w:val="0"/>
+          <w:sz w:val="21"/>
+          <w:szCs w:val="21"/>
+          <w14:ligatures w14:val="none"/>
+        </w:rPr>
+        <w:t>res</w:t>
+      </w:r>
+      <w:r>
+        <w:rPr>
+          <w:rFonts w:ascii="Consolas" w:eastAsia="Times New Roman" w:hAnsi="Consolas" w:cs="Times New Roman"/>
+          <w:color w:val="3B3B3B"/>
+          <w:kern w:val="0"/>
+          <w:sz w:val="21"/>
+          <w:szCs w:val="21"/>
+          <w14:ligatures w14:val="none"/>
+        </w:rPr>
+        <w:t>).</w:t>
+      </w:r>
+      <w:r>
+        <w:rPr>
+          <w:rFonts w:ascii="Consolas" w:eastAsia="Times New Roman" w:hAnsi="Consolas" w:cs="Times New Roman"/>
+          <w:color w:val="795E26"/>
+          <w:kern w:val="0"/>
+          <w:sz w:val="21"/>
+          <w:szCs w:val="21"/>
+          <w14:ligatures w14:val="none"/>
+        </w:rPr>
+        <w:t>toEqual</w:t>
+      </w:r>
+      <w:r>
+        <w:rPr>
+          <w:rFonts w:ascii="Consolas" w:eastAsia="Times New Roman" w:hAnsi="Consolas" w:cs="Times New Roman"/>
+          <w:color w:val="3B3B3B"/>
+          <w:kern w:val="0"/>
+          <w:sz w:val="21"/>
+          <w:szCs w:val="21"/>
+          <w14:ligatures w14:val="none"/>
+        </w:rPr>
+        <w:t>(</w:t>
+      </w:r>
+      <w:r>
+        <w:rPr>
+          <w:rFonts w:ascii="Consolas" w:eastAsia="Times New Roman" w:hAnsi="Consolas" w:cs="Times New Roman"/>
+          <w:color w:val="A31515"/>
+          <w:kern w:val="0"/>
+          <w:sz w:val="21"/>
+          <w:szCs w:val="21"/>
+          <w14:ligatures w14:val="none"/>
+        </w:rPr>
+        <w:t>'bytes'</w:t>
+      </w:r>
+      <w:r>
+        <w:rPr>
+          <w:rFonts w:ascii="Consolas" w:eastAsia="Times New Roman" w:hAnsi="Consolas" w:cs="Times New Roman"/>
+          <w:color w:val="3B3B3B"/>
+          <w:kern w:val="0"/>
+          <w:sz w:val="21"/>
+          <w:szCs w:val="21"/>
+          <w14:ligatures w14:val="none"/>
+        </w:rPr>
+        <w:t>)</w:t>
+      </w:r>
+    </w:p>
+    <w:p>
+      <w:pPr>
+        <w:shd w:val="clear" w:color="auto" w:fill="FFFFFF"/>
+        <w:spacing w:after="0" w:line="285" w:lineRule="atLeast"/>
+        <w:rPr>
+          <w:rFonts w:ascii="Consolas" w:eastAsia="Times New Roman" w:hAnsi="Consolas" w:cs="Times New Roman"/>
+          <w:color w:val="3B3B3B"/>
+          <w:kern w:val="0"/>
+          <w:sz w:val="21"/>
+          <w:szCs w:val="21"/>
+          <w14:ligatures w14:val="none"/>
+        </w:rPr>
+      </w:pPr>
+      <w:r>
+        <w:rPr>
+          <w:rFonts w:ascii="Consolas" w:eastAsia="Times New Roman" w:hAnsi="Consolas" w:cs="Times New Roman"/>
+          <w:color w:val="3B3B3B"/>
+          <w:kern w:val="0"/>
+          <w:sz w:val="21"/>
+          <w:szCs w:val="21"/>
+          <w14:ligatures w14:val="none"/>
+        </w:rPr>
+        <w:t>})</w:t>
+      </w:r>
+    </w:p>
+    <w:p>
+      <w:pPr>
+        <w:ind w:firstLine="720"/>
+      </w:pPr>
+      <w:r>
+        <w:t>*************************************************************</w:t>
+      </w:r>
+    </w:p>
+    <w:p>
+      <w:r>
+        <w:t>To use spyOn for mocking with Jest:</w:t>
+      </w:r>
+    </w:p>
+    <w:p>
+      <w:pPr>
+        <w:shd w:val="clear" w:color="auto" w:fill="FFFFFF"/>
+        <w:spacing w:after="0" w:line="285" w:lineRule="atLeast"/>
+        <w:rPr>
+          <w:rFonts w:ascii="Consolas" w:eastAsia="Times New Roman" w:hAnsi="Consolas" w:cs="Times New Roman"/>
+          <w:color w:val="3B3B3B"/>
+          <w:kern w:val="0"/>
+          <w:sz w:val="21"/>
+          <w:szCs w:val="21"/>
+          <w14:ligatures w14:val="none"/>
+        </w:rPr>
+      </w:pPr>
+      <w:r>
+        <w:rPr>
+          <w:rFonts w:ascii="Consolas" w:eastAsia="Times New Roman" w:hAnsi="Consolas" w:cs="Times New Roman"/>
+          <w:color w:val="0000FF"/>
+          <w:kern w:val="0"/>
+          <w:sz w:val="21"/>
+          <w:szCs w:val="21"/>
+          <w14:ligatures w14:val="none"/>
+        </w:rPr>
+        <w:t>const</w:t>
+      </w:r>
+      <w:r>
+        <w:rPr>
+          <w:rFonts w:ascii="Consolas" w:eastAsia="Times New Roman" w:hAnsi="Consolas" w:cs="Times New Roman"/>
+          <w:color w:val="3B3B3B"/>
+          <w:kern w:val="0"/>
+          <w:sz w:val="21"/>
+          <w:szCs w:val="21"/>
+          <w14:ligatures w14:val="none"/>
+        </w:rPr>
+        <w:t xml:space="preserve"> </w:t>
+      </w:r>
+      <w:r>
+        <w:rPr>
+          <w:rFonts w:ascii="Consolas" w:eastAsia="Times New Roman" w:hAnsi="Consolas" w:cs="Times New Roman"/>
+          <w:color w:val="267F99"/>
+          <w:kern w:val="0"/>
+          <w:sz w:val="21"/>
+          <w:szCs w:val="21"/>
+          <w14:ligatures w14:val="none"/>
+        </w:rPr>
+        <w:t>crypto</w:t>
+      </w:r>
+      <w:r>
+        <w:rPr>
+          <w:rFonts w:ascii="Consolas" w:eastAsia="Times New Roman" w:hAnsi="Consolas" w:cs="Times New Roman"/>
+          <w:color w:val="3B3B3B"/>
+          <w:kern w:val="0"/>
+          <w:sz w:val="21"/>
+          <w:szCs w:val="21"/>
+          <w14:ligatures w14:val="none"/>
+        </w:rPr>
+        <w:t xml:space="preserve"> </w:t>
+      </w:r>
+      <w:r>
+        <w:rPr>
+          <w:rFonts w:ascii="Consolas" w:eastAsia="Times New Roman" w:hAnsi="Consolas" w:cs="Times New Roman"/>
+          <w:color w:val="000000"/>
+          <w:kern w:val="0"/>
+          <w:sz w:val="21"/>
+          <w:szCs w:val="21"/>
+          <w14:ligatures w14:val="none"/>
+        </w:rPr>
+        <w:t>=</w:t>
+      </w:r>
+      <w:r>
+        <w:rPr>
+          <w:rFonts w:ascii="Consolas" w:eastAsia="Times New Roman" w:hAnsi="Consolas" w:cs="Times New Roman"/>
+          <w:color w:val="3B3B3B"/>
+          <w:kern w:val="0"/>
+          <w:sz w:val="21"/>
+          <w:szCs w:val="21"/>
+          <w14:ligatures w14:val="none"/>
+        </w:rPr>
+        <w:t xml:space="preserve"> </w:t>
+      </w:r>
+      <w:r>
+        <w:rPr>
+          <w:rFonts w:ascii="Consolas" w:eastAsia="Times New Roman" w:hAnsi="Consolas" w:cs="Times New Roman"/>
+          <w:color w:val="795E26"/>
+          <w:kern w:val="0"/>
+          <w:sz w:val="21"/>
+          <w:szCs w:val="21"/>
+          <w14:ligatures w14:val="none"/>
+        </w:rPr>
+        <w:t>require</w:t>
+      </w:r>
+      <w:r>
+        <w:rPr>
+          <w:rFonts w:ascii="Consolas" w:eastAsia="Times New Roman" w:hAnsi="Consolas" w:cs="Times New Roman"/>
+          <w:color w:val="3B3B3B"/>
+          <w:kern w:val="0"/>
+          <w:sz w:val="21"/>
+          <w:szCs w:val="21"/>
+          <w14:ligatures w14:val="none"/>
+        </w:rPr>
+        <w:t>(</w:t>
+      </w:r>
+      <w:r>
+        <w:rPr>
+          <w:rFonts w:ascii="Consolas" w:eastAsia="Times New Roman" w:hAnsi="Consolas" w:cs="Times New Roman"/>
+          <w:color w:val="A31515"/>
+          <w:kern w:val="0"/>
+          <w:sz w:val="21"/>
+          <w:szCs w:val="21"/>
+          <w14:ligatures w14:val="none"/>
+        </w:rPr>
+        <w:t>'node:crypto'</w:t>
+      </w:r>
+      <w:r>
+        <w:rPr>
+          <w:rFonts w:ascii="Consolas" w:eastAsia="Times New Roman" w:hAnsi="Consolas" w:cs="Times New Roman"/>
+          <w:color w:val="3B3B3B"/>
+          <w:kern w:val="0"/>
+          <w:sz w:val="21"/>
+          <w:szCs w:val="21"/>
+          <w14:ligatures w14:val="none"/>
+        </w:rPr>
+        <w:t>)</w:t>
+      </w:r>
+    </w:p>
+    <w:p>
+      <w:pPr>
+        <w:shd w:val="clear" w:color="auto" w:fill="FFFFFF"/>
+        <w:spacing w:after="0" w:line="285" w:lineRule="atLeast"/>
+        <w:rPr>
+          <w:rFonts w:ascii="Consolas" w:eastAsia="Times New Roman" w:hAnsi="Consolas" w:cs="Times New Roman"/>
+          <w:color w:val="3B3B3B"/>
+          <w:kern w:val="0"/>
+          <w:sz w:val="21"/>
+          <w:szCs w:val="21"/>
+          <w14:ligatures w14:val="none"/>
+        </w:rPr>
+      </w:pPr>
+      <w:r>
+        <w:rPr>
+          <w:rFonts w:ascii="Consolas" w:eastAsia="Times New Roman" w:hAnsi="Consolas" w:cs="Times New Roman"/>
+          <w:color w:val="0000FF"/>
+          <w:kern w:val="0"/>
+          <w:sz w:val="21"/>
+          <w:szCs w:val="21"/>
+          <w14:ligatures w14:val="none"/>
+        </w:rPr>
+        <w:t>const</w:t>
+      </w:r>
+      <w:r>
+        <w:rPr>
+          <w:rFonts w:ascii="Consolas" w:eastAsia="Times New Roman" w:hAnsi="Consolas" w:cs="Times New Roman"/>
+          <w:color w:val="3B3B3B"/>
+          <w:kern w:val="0"/>
+          <w:sz w:val="21"/>
+          <w:szCs w:val="21"/>
+          <w14:ligatures w14:val="none"/>
+        </w:rPr>
+        <w:t xml:space="preserve"> { </w:t>
+      </w:r>
+      <w:r>
+        <w:rPr>
+          <w:rFonts w:ascii="Consolas" w:eastAsia="Times New Roman" w:hAnsi="Consolas" w:cs="Times New Roman"/>
+          <w:color w:val="795E26"/>
+          <w:kern w:val="0"/>
+          <w:sz w:val="21"/>
+          <w:szCs w:val="21"/>
+          <w14:ligatures w14:val="none"/>
+        </w:rPr>
+        <w:t>getData</w:t>
+      </w:r>
+      <w:r>
+        <w:rPr>
+          <w:rFonts w:ascii="Consolas" w:eastAsia="Times New Roman" w:hAnsi="Consolas" w:cs="Times New Roman"/>
+          <w:color w:val="3B3B3B"/>
+          <w:kern w:val="0"/>
+          <w:sz w:val="21"/>
+          <w:szCs w:val="21"/>
+          <w14:ligatures w14:val="none"/>
+        </w:rPr>
+        <w:t xml:space="preserve"> } </w:t>
+      </w:r>
+      <w:r>
+        <w:rPr>
+          <w:rFonts w:ascii="Consolas" w:eastAsia="Times New Roman" w:hAnsi="Consolas" w:cs="Times New Roman"/>
+          <w:color w:val="000000"/>
+          <w:kern w:val="0"/>
+          <w:sz w:val="21"/>
+          <w:szCs w:val="21"/>
+          <w14:ligatures w14:val="none"/>
+        </w:rPr>
+        <w:t>=</w:t>
+      </w:r>
+      <w:r>
+        <w:rPr>
+          <w:rFonts w:ascii="Consolas" w:eastAsia="Times New Roman" w:hAnsi="Consolas" w:cs="Times New Roman"/>
+          <w:color w:val="3B3B3B"/>
+          <w:kern w:val="0"/>
+          <w:sz w:val="21"/>
+          <w:szCs w:val="21"/>
+          <w14:ligatures w14:val="none"/>
+        </w:rPr>
+        <w:t xml:space="preserve"> </w:t>
+      </w:r>
+      <w:r>
+        <w:rPr>
+          <w:rFonts w:ascii="Consolas" w:eastAsia="Times New Roman" w:hAnsi="Consolas" w:cs="Times New Roman"/>
+          <w:color w:val="795E26"/>
+          <w:kern w:val="0"/>
+          <w:sz w:val="21"/>
+          <w:szCs w:val="21"/>
+          <w14:ligatures w14:val="none"/>
+        </w:rPr>
+        <w:t>require</w:t>
+      </w:r>
+      <w:r>
+        <w:rPr>
+          <w:rFonts w:ascii="Consolas" w:eastAsia="Times New Roman" w:hAnsi="Consolas" w:cs="Times New Roman"/>
+          <w:color w:val="3B3B3B"/>
+          <w:kern w:val="0"/>
+          <w:sz w:val="21"/>
+          <w:szCs w:val="21"/>
+          <w14:ligatures w14:val="none"/>
+        </w:rPr>
+        <w:t>(</w:t>
+      </w:r>
+      <w:r>
+        <w:rPr>
+          <w:rFonts w:ascii="Consolas" w:eastAsia="Times New Roman" w:hAnsi="Consolas" w:cs="Times New Roman"/>
+          <w:color w:val="A31515"/>
+          <w:kern w:val="0"/>
+          <w:sz w:val="21"/>
+          <w:szCs w:val="21"/>
+          <w14:ligatures w14:val="none"/>
+        </w:rPr>
+        <w:t>'../app'</w:t>
+      </w:r>
+      <w:r>
+        <w:rPr>
+          <w:rFonts w:ascii="Consolas" w:eastAsia="Times New Roman" w:hAnsi="Consolas" w:cs="Times New Roman"/>
+          <w:color w:val="3B3B3B"/>
+          <w:kern w:val="0"/>
+          <w:sz w:val="21"/>
+          <w:szCs w:val="21"/>
+          <w14:ligatures w14:val="none"/>
+        </w:rPr>
+        <w:t>)</w:t>
+      </w:r>
+    </w:p>
+    <w:p>
+      <w:pPr>
+        <w:shd w:val="clear" w:color="auto" w:fill="FFFFFF"/>
+        <w:spacing w:after="0" w:line="285" w:lineRule="atLeast"/>
+        <w:rPr>
+          <w:rFonts w:ascii="Consolas" w:eastAsia="Times New Roman" w:hAnsi="Consolas" w:cs="Times New Roman"/>
+          <w:color w:val="3B3B3B"/>
+          <w:kern w:val="0"/>
+          <w:sz w:val="21"/>
+          <w:szCs w:val="21"/>
+          <w14:ligatures w14:val="none"/>
+        </w:rPr>
+      </w:pPr>
+    </w:p>
+    <w:p>
+      <w:pPr>
+        <w:shd w:val="clear" w:color="auto" w:fill="FFFFFF"/>
+        <w:spacing w:after="0" w:line="285" w:lineRule="atLeast"/>
+        <w:rPr>
+          <w:rFonts w:ascii="Consolas" w:eastAsia="Times New Roman" w:hAnsi="Consolas" w:cs="Times New Roman"/>
+          <w:color w:val="3B3B3B"/>
+          <w:kern w:val="0"/>
+          <w:sz w:val="21"/>
+          <w:szCs w:val="21"/>
+          <w14:ligatures w14:val="none"/>
+        </w:rPr>
+      </w:pPr>
+      <w:r>
+        <w:rPr>
+          <w:rFonts w:ascii="Consolas" w:eastAsia="Times New Roman" w:hAnsi="Consolas" w:cs="Times New Roman"/>
+          <w:color w:val="795E26"/>
+          <w:kern w:val="0"/>
+          <w:sz w:val="21"/>
+          <w:szCs w:val="21"/>
+          <w14:ligatures w14:val="none"/>
+        </w:rPr>
+        <w:t>test</w:t>
+      </w:r>
+      <w:r>
+        <w:rPr>
+          <w:rFonts w:ascii="Consolas" w:eastAsia="Times New Roman" w:hAnsi="Consolas" w:cs="Times New Roman"/>
+          <w:color w:val="3B3B3B"/>
+          <w:kern w:val="0"/>
+          <w:sz w:val="21"/>
+          <w:szCs w:val="21"/>
+          <w14:ligatures w14:val="none"/>
+        </w:rPr>
+        <w:t>(</w:t>
+      </w:r>
+      <w:r>
+        <w:rPr>
+          <w:rFonts w:ascii="Consolas" w:eastAsia="Times New Roman" w:hAnsi="Consolas" w:cs="Times New Roman"/>
+          <w:color w:val="A31515"/>
+          <w:kern w:val="0"/>
+          <w:sz w:val="21"/>
+          <w:szCs w:val="21"/>
+          <w14:ligatures w14:val="none"/>
+        </w:rPr>
+        <w:t>'testing spyOn'</w:t>
+      </w:r>
+      <w:r>
+        <w:rPr>
+          <w:rFonts w:ascii="Consolas" w:eastAsia="Times New Roman" w:hAnsi="Consolas" w:cs="Times New Roman"/>
+          <w:color w:val="3B3B3B"/>
+          <w:kern w:val="0"/>
+          <w:sz w:val="21"/>
+          <w:szCs w:val="21"/>
+          <w14:ligatures w14:val="none"/>
+        </w:rPr>
+        <w:t xml:space="preserve">, </w:t>
+      </w:r>
+      <w:r>
+        <w:rPr>
+          <w:rFonts w:ascii="Consolas" w:eastAsia="Times New Roman" w:hAnsi="Consolas" w:cs="Times New Roman"/>
+          <w:color w:val="0000FF"/>
+          <w:kern w:val="0"/>
+          <w:sz w:val="21"/>
+          <w:szCs w:val="21"/>
+          <w14:ligatures w14:val="none"/>
+        </w:rPr>
+        <w:t>async</w:t>
+      </w:r>
+      <w:r>
+        <w:rPr>
+          <w:rFonts w:ascii="Consolas" w:eastAsia="Times New Roman" w:hAnsi="Consolas" w:cs="Times New Roman"/>
+          <w:color w:val="3B3B3B"/>
+          <w:kern w:val="0"/>
+          <w:sz w:val="21"/>
+          <w:szCs w:val="21"/>
+          <w14:ligatures w14:val="none"/>
+        </w:rPr>
+        <w:t xml:space="preserve"> () </w:t>
+      </w:r>
+      <w:r>
+        <w:rPr>
+          <w:rFonts w:ascii="Consolas" w:eastAsia="Times New Roman" w:hAnsi="Consolas" w:cs="Times New Roman"/>
+          <w:color w:val="0000FF"/>
+          <w:kern w:val="0"/>
+          <w:sz w:val="21"/>
+          <w:szCs w:val="21"/>
+          <w14:ligatures w14:val="none"/>
+        </w:rPr>
+        <w:t>=&gt;</w:t>
+      </w:r>
+      <w:r>
+        <w:rPr>
+          <w:rFonts w:ascii="Consolas" w:eastAsia="Times New Roman" w:hAnsi="Consolas" w:cs="Times New Roman"/>
+          <w:color w:val="3B3B3B"/>
+          <w:kern w:val="0"/>
+          <w:sz w:val="21"/>
+          <w:szCs w:val="21"/>
+          <w14:ligatures w14:val="none"/>
+        </w:rPr>
+        <w:t xml:space="preserve"> {</w:t>
+      </w:r>
+    </w:p>
+    <w:p>
+      <w:pPr>
+        <w:shd w:val="clear" w:color="auto" w:fill="FFFFFF"/>
+        <w:spacing w:after="0" w:line="285" w:lineRule="atLeast"/>
+        <w:rPr>
+          <w:rFonts w:ascii="Consolas" w:eastAsia="Times New Roman" w:hAnsi="Consolas" w:cs="Times New Roman"/>
+          <w:color w:val="3B3B3B"/>
+          <w:kern w:val="0"/>
+          <w:sz w:val="21"/>
+          <w:szCs w:val="21"/>
+          <w14:ligatures w14:val="none"/>
+        </w:rPr>
+      </w:pPr>
+      <w:r>
+        <w:rPr>
+          <w:rFonts w:ascii="Consolas" w:eastAsia="Times New Roman" w:hAnsi="Consolas" w:cs="Times New Roman"/>
+          <w:color w:val="3B3B3B"/>
+          <w:kern w:val="0"/>
+          <w:sz w:val="21"/>
+          <w:szCs w:val="21"/>
+          <w14:ligatures w14:val="none"/>
+        </w:rPr>
+        <w:t xml:space="preserve">    </w:t>
+      </w:r>
+      <w:r>
+        <w:rPr>
+          <w:rFonts w:ascii="Consolas" w:eastAsia="Times New Roman" w:hAnsi="Consolas" w:cs="Times New Roman"/>
+          <w:color w:val="267F99"/>
+          <w:kern w:val="0"/>
+          <w:sz w:val="21"/>
+          <w:szCs w:val="21"/>
+          <w14:ligatures w14:val="none"/>
+        </w:rPr>
+        <w:t>jest</w:t>
+      </w:r>
+      <w:r>
+        <w:rPr>
+          <w:rFonts w:ascii="Consolas" w:eastAsia="Times New Roman" w:hAnsi="Consolas" w:cs="Times New Roman"/>
+          <w:color w:val="3B3B3B"/>
+          <w:kern w:val="0"/>
+          <w:sz w:val="21"/>
+          <w:szCs w:val="21"/>
+          <w14:ligatures w14:val="none"/>
+        </w:rPr>
+        <w:t>.</w:t>
+      </w:r>
+      <w:r>
+        <w:rPr>
+          <w:rFonts w:ascii="Consolas" w:eastAsia="Times New Roman" w:hAnsi="Consolas" w:cs="Times New Roman"/>
+          <w:color w:val="795E26"/>
+          <w:kern w:val="0"/>
+          <w:sz w:val="21"/>
+          <w:szCs w:val="21"/>
+          <w14:ligatures w14:val="none"/>
+        </w:rPr>
+        <w:t>spyOn</w:t>
+      </w:r>
+      <w:r>
+        <w:rPr>
+          <w:rFonts w:ascii="Consolas" w:eastAsia="Times New Roman" w:hAnsi="Consolas" w:cs="Times New Roman"/>
+          <w:color w:val="3B3B3B"/>
+          <w:kern w:val="0"/>
+          <w:sz w:val="21"/>
+          <w:szCs w:val="21"/>
+          <w14:ligatures w14:val="none"/>
+        </w:rPr>
+        <w:t>(</w:t>
+      </w:r>
+      <w:r>
+        <w:rPr>
+          <w:rFonts w:ascii="Consolas" w:eastAsia="Times New Roman" w:hAnsi="Consolas" w:cs="Times New Roman"/>
+          <w:color w:val="267F99"/>
+          <w:kern w:val="0"/>
+          <w:sz w:val="21"/>
+          <w:szCs w:val="21"/>
+          <w14:ligatures w14:val="none"/>
+        </w:rPr>
+        <w:t>crypto</w:t>
+      </w:r>
+      <w:r>
+        <w:rPr>
+          <w:rFonts w:ascii="Consolas" w:eastAsia="Times New Roman" w:hAnsi="Consolas" w:cs="Times New Roman"/>
+          <w:color w:val="3B3B3B"/>
+          <w:kern w:val="0"/>
+          <w:sz w:val="21"/>
+          <w:szCs w:val="21"/>
+          <w14:ligatures w14:val="none"/>
+        </w:rPr>
+        <w:t xml:space="preserve">, </w:t>
+      </w:r>
+      <w:r>
+        <w:rPr>
+          <w:rFonts w:ascii="Consolas" w:eastAsia="Times New Roman" w:hAnsi="Consolas" w:cs="Times New Roman"/>
+          <w:color w:val="A31515"/>
+          <w:kern w:val="0"/>
+          <w:sz w:val="21"/>
+          <w:szCs w:val="21"/>
+          <w14:ligatures w14:val="none"/>
+        </w:rPr>
+        <w:t>'randomBytes'</w:t>
+      </w:r>
+      <w:r>
+        <w:rPr>
+          <w:rFonts w:ascii="Consolas" w:eastAsia="Times New Roman" w:hAnsi="Consolas" w:cs="Times New Roman"/>
+          <w:color w:val="3B3B3B"/>
+          <w:kern w:val="0"/>
+          <w:sz w:val="21"/>
+          <w:szCs w:val="21"/>
+          <w14:ligatures w14:val="none"/>
+        </w:rPr>
+        <w:t>).</w:t>
+      </w:r>
+      <w:r>
+        <w:rPr>
+          <w:rFonts w:ascii="Consolas" w:eastAsia="Times New Roman" w:hAnsi="Consolas" w:cs="Times New Roman"/>
+          <w:color w:val="795E26"/>
+          <w:kern w:val="0"/>
+          <w:sz w:val="21"/>
+          <w:szCs w:val="21"/>
+          <w14:ligatures w14:val="none"/>
+        </w:rPr>
+        <w:t>mockImplementationOnce</w:t>
+      </w:r>
+      <w:r>
+        <w:rPr>
+          <w:rFonts w:ascii="Consolas" w:eastAsia="Times New Roman" w:hAnsi="Consolas" w:cs="Times New Roman"/>
+          <w:color w:val="3B3B3B"/>
+          <w:kern w:val="0"/>
+          <w:sz w:val="21"/>
+          <w:szCs w:val="21"/>
+          <w14:ligatures w14:val="none"/>
+        </w:rPr>
+        <w:t>(()</w:t>
+      </w:r>
+      <w:r>
+        <w:rPr>
+          <w:rFonts w:ascii="Consolas" w:eastAsia="Times New Roman" w:hAnsi="Consolas" w:cs="Times New Roman"/>
+          <w:color w:val="0000FF"/>
+          <w:kern w:val="0"/>
+          <w:sz w:val="21"/>
+          <w:szCs w:val="21"/>
+          <w14:ligatures w14:val="none"/>
+        </w:rPr>
+        <w:t>=&gt;</w:t>
+      </w:r>
+      <w:r>
+        <w:rPr>
+          <w:rFonts w:ascii="Consolas" w:eastAsia="Times New Roman" w:hAnsi="Consolas" w:cs="Times New Roman"/>
+          <w:color w:val="267F99"/>
+          <w:kern w:val="0"/>
+          <w:sz w:val="21"/>
+          <w:szCs w:val="21"/>
+          <w14:ligatures w14:val="none"/>
+        </w:rPr>
+        <w:t>Promise</w:t>
+      </w:r>
+      <w:r>
+        <w:rPr>
+          <w:rFonts w:ascii="Consolas" w:eastAsia="Times New Roman" w:hAnsi="Consolas" w:cs="Times New Roman"/>
+          <w:color w:val="3B3B3B"/>
+          <w:kern w:val="0"/>
+          <w:sz w:val="21"/>
+          <w:szCs w:val="21"/>
+          <w14:ligatures w14:val="none"/>
+        </w:rPr>
+        <w:t>.</w:t>
+      </w:r>
+      <w:r>
+        <w:rPr>
+          <w:rFonts w:ascii="Consolas" w:eastAsia="Times New Roman" w:hAnsi="Consolas" w:cs="Times New Roman"/>
+          <w:color w:val="795E26"/>
+          <w:kern w:val="0"/>
+          <w:sz w:val="21"/>
+          <w:szCs w:val="21"/>
+          <w14:ligatures w14:val="none"/>
+        </w:rPr>
+        <w:t>resolve</w:t>
+      </w:r>
+      <w:r>
+        <w:rPr>
+          <w:rFonts w:ascii="Consolas" w:eastAsia="Times New Roman" w:hAnsi="Consolas" w:cs="Times New Roman"/>
+          <w:color w:val="3B3B3B"/>
+          <w:kern w:val="0"/>
+          <w:sz w:val="21"/>
+          <w:szCs w:val="21"/>
+          <w14:ligatures w14:val="none"/>
+        </w:rPr>
+        <w:t>(</w:t>
+      </w:r>
+      <w:r>
+        <w:rPr>
+          <w:rFonts w:ascii="Consolas" w:eastAsia="Times New Roman" w:hAnsi="Consolas" w:cs="Times New Roman"/>
+          <w:color w:val="A31515"/>
+          <w:kern w:val="0"/>
+          <w:sz w:val="21"/>
+          <w:szCs w:val="21"/>
+          <w14:ligatures w14:val="none"/>
+        </w:rPr>
+        <w:t>'JLoka'</w:t>
+      </w:r>
+      <w:r>
+        <w:rPr>
+          <w:rFonts w:ascii="Consolas" w:eastAsia="Times New Roman" w:hAnsi="Consolas" w:cs="Times New Roman"/>
+          <w:color w:val="3B3B3B"/>
+          <w:kern w:val="0"/>
+          <w:sz w:val="21"/>
+          <w:szCs w:val="21"/>
+          <w14:ligatures w14:val="none"/>
+        </w:rPr>
+        <w:t>))</w:t>
+      </w:r>
+    </w:p>
+    <w:p>
+      <w:pPr>
+        <w:shd w:val="clear" w:color="auto" w:fill="FFFFFF"/>
+        <w:spacing w:after="0" w:line="285" w:lineRule="atLeast"/>
+        <w:rPr>
+          <w:rFonts w:ascii="Consolas" w:eastAsia="Times New Roman" w:hAnsi="Consolas" w:cs="Times New Roman"/>
+          <w:color w:val="3B3B3B"/>
+          <w:kern w:val="0"/>
+          <w:sz w:val="21"/>
+          <w:szCs w:val="21"/>
+          <w14:ligatures w14:val="none"/>
+        </w:rPr>
+      </w:pPr>
+    </w:p>
+    <w:p>
+      <w:pPr>
+        <w:shd w:val="clear" w:color="auto" w:fill="FFFFFF"/>
+        <w:spacing w:after="0" w:line="285" w:lineRule="atLeast"/>
+        <w:rPr>
+          <w:rFonts w:ascii="Consolas" w:eastAsia="Times New Roman" w:hAnsi="Consolas" w:cs="Times New Roman"/>
+          <w:color w:val="3B3B3B"/>
+          <w:kern w:val="0"/>
+          <w:sz w:val="21"/>
+          <w:szCs w:val="21"/>
+          <w14:ligatures w14:val="none"/>
+        </w:rPr>
+      </w:pPr>
+      <w:r>
+        <w:rPr>
+          <w:rFonts w:ascii="Consolas" w:eastAsia="Times New Roman" w:hAnsi="Consolas" w:cs="Times New Roman"/>
+          <w:color w:val="3B3B3B"/>
+          <w:kern w:val="0"/>
+          <w:sz w:val="21"/>
+          <w:szCs w:val="21"/>
+          <w14:ligatures w14:val="none"/>
+        </w:rPr>
+        <w:t xml:space="preserve">    </w:t>
+      </w:r>
+      <w:r>
+        <w:rPr>
+          <w:rFonts w:ascii="Consolas" w:eastAsia="Times New Roman" w:hAnsi="Consolas" w:cs="Times New Roman"/>
+          <w:color w:val="0000FF"/>
+          <w:kern w:val="0"/>
+          <w:sz w:val="21"/>
+          <w:szCs w:val="21"/>
+          <w14:ligatures w14:val="none"/>
+        </w:rPr>
+        <w:t>const</w:t>
+      </w:r>
+      <w:r>
+        <w:rPr>
+          <w:rFonts w:ascii="Consolas" w:eastAsia="Times New Roman" w:hAnsi="Consolas" w:cs="Times New Roman"/>
+          <w:color w:val="3B3B3B"/>
+          <w:kern w:val="0"/>
+          <w:sz w:val="21"/>
+          <w:szCs w:val="21"/>
+          <w14:ligatures w14:val="none"/>
+        </w:rPr>
+        <w:t xml:space="preserve"> </w:t>
+      </w:r>
+      <w:r>
+        <w:rPr>
+          <w:rFonts w:ascii="Consolas" w:eastAsia="Times New Roman" w:hAnsi="Consolas" w:cs="Times New Roman"/>
+          <w:color w:val="0070C1"/>
+          <w:kern w:val="0"/>
+          <w:sz w:val="21"/>
+          <w:szCs w:val="21"/>
+          <w14:ligatures w14:val="none"/>
+        </w:rPr>
+        <w:t>t1</w:t>
+      </w:r>
+      <w:r>
+        <w:rPr>
+          <w:rFonts w:ascii="Consolas" w:eastAsia="Times New Roman" w:hAnsi="Consolas" w:cs="Times New Roman"/>
+          <w:color w:val="3B3B3B"/>
+          <w:kern w:val="0"/>
+          <w:sz w:val="21"/>
+          <w:szCs w:val="21"/>
+          <w14:ligatures w14:val="none"/>
+        </w:rPr>
+        <w:t xml:space="preserve"> </w:t>
+      </w:r>
+      <w:r>
+        <w:rPr>
+          <w:rFonts w:ascii="Consolas" w:eastAsia="Times New Roman" w:hAnsi="Consolas" w:cs="Times New Roman"/>
+          <w:color w:val="000000"/>
+          <w:kern w:val="0"/>
+          <w:sz w:val="21"/>
+          <w:szCs w:val="21"/>
+          <w14:ligatures w14:val="none"/>
+        </w:rPr>
+        <w:t>=</w:t>
+      </w:r>
+      <w:r>
+        <w:rPr>
+          <w:rFonts w:ascii="Consolas" w:eastAsia="Times New Roman" w:hAnsi="Consolas" w:cs="Times New Roman"/>
+          <w:color w:val="3B3B3B"/>
+          <w:kern w:val="0"/>
+          <w:sz w:val="21"/>
+          <w:szCs w:val="21"/>
+          <w14:ligatures w14:val="none"/>
+        </w:rPr>
+        <w:t xml:space="preserve"> </w:t>
+      </w:r>
+      <w:r>
+        <w:rPr>
+          <w:rFonts w:ascii="Consolas" w:eastAsia="Times New Roman" w:hAnsi="Consolas" w:cs="Times New Roman"/>
+          <w:color w:val="AF00DB"/>
+          <w:kern w:val="0"/>
+          <w:sz w:val="21"/>
+          <w:szCs w:val="21"/>
+          <w14:ligatures w14:val="none"/>
+        </w:rPr>
+        <w:t>await</w:t>
+      </w:r>
+      <w:r>
+        <w:rPr>
+          <w:rFonts w:ascii="Consolas" w:eastAsia="Times New Roman" w:hAnsi="Consolas" w:cs="Times New Roman"/>
+          <w:color w:val="3B3B3B"/>
+          <w:kern w:val="0"/>
+          <w:sz w:val="21"/>
+          <w:szCs w:val="21"/>
+          <w14:ligatures w14:val="none"/>
+        </w:rPr>
+        <w:t xml:space="preserve"> </w:t>
+      </w:r>
+      <w:r>
+        <w:rPr>
+          <w:rFonts w:ascii="Consolas" w:eastAsia="Times New Roman" w:hAnsi="Consolas" w:cs="Times New Roman"/>
+          <w:color w:val="795E26"/>
+          <w:kern w:val="0"/>
+          <w:sz w:val="21"/>
+          <w:szCs w:val="21"/>
+          <w14:ligatures w14:val="none"/>
+        </w:rPr>
+        <w:t>getData</w:t>
+      </w:r>
+      <w:r>
+        <w:rPr>
+          <w:rFonts w:ascii="Consolas" w:eastAsia="Times New Roman" w:hAnsi="Consolas" w:cs="Times New Roman"/>
+          <w:color w:val="3B3B3B"/>
+          <w:kern w:val="0"/>
+          <w:sz w:val="21"/>
+          <w:szCs w:val="21"/>
+          <w14:ligatures w14:val="none"/>
+        </w:rPr>
+        <w:t>()</w:t>
+      </w:r>
+    </w:p>
+    <w:p>
+      <w:pPr>
+        <w:shd w:val="clear" w:color="auto" w:fill="FFFFFF"/>
+        <w:spacing w:after="0" w:line="285" w:lineRule="atLeast"/>
+        <w:rPr>
+          <w:rFonts w:ascii="Consolas" w:eastAsia="Times New Roman" w:hAnsi="Consolas" w:cs="Times New Roman"/>
+          <w:color w:val="3B3B3B"/>
+          <w:kern w:val="0"/>
+          <w:sz w:val="21"/>
+          <w:szCs w:val="21"/>
+          <w14:ligatures w14:val="none"/>
+        </w:rPr>
+      </w:pPr>
+      <w:r>
+        <w:rPr>
+          <w:rFonts w:ascii="Consolas" w:eastAsia="Times New Roman" w:hAnsi="Consolas" w:cs="Times New Roman"/>
+          <w:color w:val="3B3B3B"/>
+          <w:kern w:val="0"/>
+          <w:sz w:val="21"/>
+          <w:szCs w:val="21"/>
+          <w14:ligatures w14:val="none"/>
+        </w:rPr>
+        <w:t xml:space="preserve">    </w:t>
+      </w:r>
+      <w:r>
+        <w:rPr>
+          <w:rFonts w:ascii="Consolas" w:eastAsia="Times New Roman" w:hAnsi="Consolas" w:cs="Times New Roman"/>
+          <w:color w:val="795E26"/>
+          <w:kern w:val="0"/>
+          <w:sz w:val="21"/>
+          <w:szCs w:val="21"/>
+          <w14:ligatures w14:val="none"/>
+        </w:rPr>
+        <w:t>expect</w:t>
+      </w:r>
+      <w:r>
+        <w:rPr>
+          <w:rFonts w:ascii="Consolas" w:eastAsia="Times New Roman" w:hAnsi="Consolas" w:cs="Times New Roman"/>
+          <w:color w:val="3B3B3B"/>
+          <w:kern w:val="0"/>
+          <w:sz w:val="21"/>
+          <w:szCs w:val="21"/>
+          <w14:ligatures w14:val="none"/>
+        </w:rPr>
+        <w:t>(</w:t>
+      </w:r>
+      <w:r>
+        <w:rPr>
+          <w:rFonts w:ascii="Consolas" w:eastAsia="Times New Roman" w:hAnsi="Consolas" w:cs="Times New Roman"/>
+          <w:color w:val="0070C1"/>
+          <w:kern w:val="0"/>
+          <w:sz w:val="21"/>
+          <w:szCs w:val="21"/>
+          <w14:ligatures w14:val="none"/>
+        </w:rPr>
+        <w:t>t1</w:t>
+      </w:r>
+      <w:r>
+        <w:rPr>
+          <w:rFonts w:ascii="Consolas" w:eastAsia="Times New Roman" w:hAnsi="Consolas" w:cs="Times New Roman"/>
+          <w:color w:val="3B3B3B"/>
+          <w:kern w:val="0"/>
+          <w:sz w:val="21"/>
+          <w:szCs w:val="21"/>
+          <w14:ligatures w14:val="none"/>
+        </w:rPr>
+        <w:t>).</w:t>
+      </w:r>
+      <w:r>
+        <w:rPr>
+          <w:rFonts w:ascii="Consolas" w:eastAsia="Times New Roman" w:hAnsi="Consolas" w:cs="Times New Roman"/>
+          <w:color w:val="795E26"/>
+          <w:kern w:val="0"/>
+          <w:sz w:val="21"/>
+          <w:szCs w:val="21"/>
+          <w14:ligatures w14:val="none"/>
+        </w:rPr>
+        <w:t>toEqual</w:t>
+      </w:r>
+      <w:r>
+        <w:rPr>
+          <w:rFonts w:ascii="Consolas" w:eastAsia="Times New Roman" w:hAnsi="Consolas" w:cs="Times New Roman"/>
+          <w:color w:val="3B3B3B"/>
+          <w:kern w:val="0"/>
+          <w:sz w:val="21"/>
+          <w:szCs w:val="21"/>
+          <w14:ligatures w14:val="none"/>
+        </w:rPr>
+        <w:t>(</w:t>
+      </w:r>
+      <w:r>
+        <w:rPr>
+          <w:rFonts w:ascii="Consolas" w:eastAsia="Times New Roman" w:hAnsi="Consolas" w:cs="Times New Roman"/>
+          <w:color w:val="A31515"/>
+          <w:kern w:val="0"/>
+          <w:sz w:val="21"/>
+          <w:szCs w:val="21"/>
+          <w14:ligatures w14:val="none"/>
+        </w:rPr>
+        <w:t>'JLoka'</w:t>
+      </w:r>
+      <w:r>
+        <w:rPr>
+          <w:rFonts w:ascii="Consolas" w:eastAsia="Times New Roman" w:hAnsi="Consolas" w:cs="Times New Roman"/>
+          <w:color w:val="3B3B3B"/>
+          <w:kern w:val="0"/>
+          <w:sz w:val="21"/>
+          <w:szCs w:val="21"/>
+          <w14:ligatures w14:val="none"/>
+        </w:rPr>
+        <w:t>)</w:t>
+      </w:r>
+    </w:p>
+    <w:p>
+      <w:pPr>
+        <w:shd w:val="clear" w:color="auto" w:fill="FFFFFF"/>
+        <w:spacing w:after="0" w:line="285" w:lineRule="atLeast"/>
+        <w:rPr>
+          <w:rFonts w:ascii="Consolas" w:eastAsia="Times New Roman" w:hAnsi="Consolas" w:cs="Times New Roman"/>
+          <w:color w:val="3B3B3B"/>
+          <w:kern w:val="0"/>
+          <w:sz w:val="21"/>
+          <w:szCs w:val="21"/>
+          <w14:ligatures w14:val="none"/>
+        </w:rPr>
+      </w:pPr>
+      <w:r>
+        <w:rPr>
+          <w:rFonts w:ascii="Consolas" w:eastAsia="Times New Roman" w:hAnsi="Consolas" w:cs="Times New Roman"/>
+          <w:color w:val="3B3B3B"/>
+          <w:kern w:val="0"/>
+          <w:sz w:val="21"/>
+          <w:szCs w:val="21"/>
+          <w14:ligatures w14:val="none"/>
+        </w:rPr>
+        <w:t>})</w:t>
       </w:r>
     </w:p>
     <w:p>

</xml_diff>